<commit_message>
Añadir apartados nuevos al chartering report
</commit_message>
<xml_diff>
--- a/reports/Deliverable D01 (Level C)/Group/Chartering report.docx
+++ b/reports/Deliverable D01 (Level C)/Group/Chartering report.docx
@@ -329,208 +329,16 @@
       </w:pPr>
     </w:p>
     <w:p/>
-    <w:p>
-      <w:pPr>
-        <w:pBdr>
-          <w:bottom w:val="single" w:sz="6" w:space="1" w:color="auto"/>
-        </w:pBdr>
-        <w:rPr>
-          <w:rFonts w:ascii="Calibri" w:hAnsi="Calibri" w:cs="Calibri"/>
-          <w:sz w:val="28"/>
-          <w:szCs w:val="28"/>
-        </w:rPr>
-      </w:pPr>
-      <w:r>
-        <w:rPr>
-          <w:rFonts w:ascii="Calibri" w:hAnsi="Calibri" w:cs="Calibri"/>
-          <w:sz w:val="28"/>
-          <w:szCs w:val="28"/>
-        </w:rPr>
-        <w:lastRenderedPageBreak/>
-        <w:t>Histórico de modificaciones del documento</w:t>
-      </w:r>
-    </w:p>
-    <w:p/>
-    <w:tbl>
-      <w:tblPr>
-        <w:tblStyle w:val="Tablaconcuadrcula"/>
-        <w:tblW w:w="0" w:type="auto"/>
-        <w:tblLook w:val="04A0" w:firstRow="1" w:lastRow="0" w:firstColumn="1" w:lastColumn="0" w:noHBand="0" w:noVBand="1"/>
-      </w:tblPr>
-      <w:tblGrid>
-        <w:gridCol w:w="1413"/>
-        <w:gridCol w:w="1984"/>
-        <w:gridCol w:w="5097"/>
-      </w:tblGrid>
-      <w:tr>
-        <w:tc>
-          <w:tcPr>
-            <w:tcW w:w="1413" w:type="dxa"/>
-            <w:shd w:val="clear" w:color="auto" w:fill="156082"/>
-          </w:tcPr>
-          <w:p>
-            <w:pPr>
-              <w:rPr>
-                <w:rFonts w:ascii="Calibri" w:hAnsi="Calibri" w:cs="Calibri"/>
-                <w:color w:val="FFFFFF" w:themeColor="background1"/>
-              </w:rPr>
-            </w:pPr>
-            <w:r>
-              <w:rPr>
-                <w:rFonts w:ascii="Calibri" w:hAnsi="Calibri" w:cs="Calibri"/>
-                <w:color w:val="FFFFFF" w:themeColor="background1"/>
-              </w:rPr>
-              <w:t>Fecha</w:t>
-            </w:r>
-          </w:p>
-        </w:tc>
-        <w:tc>
-          <w:tcPr>
-            <w:tcW w:w="1984" w:type="dxa"/>
-            <w:shd w:val="clear" w:color="auto" w:fill="156082"/>
-          </w:tcPr>
-          <w:p>
-            <w:pPr>
-              <w:rPr>
-                <w:rFonts w:ascii="Calibri" w:hAnsi="Calibri" w:cs="Calibri"/>
-                <w:color w:val="FFFFFF" w:themeColor="background1"/>
-              </w:rPr>
-            </w:pPr>
-            <w:r>
-              <w:rPr>
-                <w:rFonts w:ascii="Calibri" w:hAnsi="Calibri" w:cs="Calibri"/>
-                <w:color w:val="FFFFFF" w:themeColor="background1"/>
-              </w:rPr>
-              <w:t>Realizada por</w:t>
-            </w:r>
-          </w:p>
-        </w:tc>
-        <w:tc>
-          <w:tcPr>
-            <w:tcW w:w="5097" w:type="dxa"/>
-            <w:shd w:val="clear" w:color="auto" w:fill="156082"/>
-          </w:tcPr>
-          <w:p>
-            <w:pPr>
-              <w:rPr>
-                <w:rFonts w:ascii="Calibri" w:hAnsi="Calibri" w:cs="Calibri"/>
-                <w:b/>
-                <w:bCs/>
-                <w:color w:val="FFFFFF" w:themeColor="background1"/>
-              </w:rPr>
-            </w:pPr>
-            <w:r>
-              <w:rPr>
-                <w:rFonts w:ascii="Calibri" w:hAnsi="Calibri" w:cs="Calibri"/>
-                <w:color w:val="FFFFFF" w:themeColor="background1"/>
-              </w:rPr>
-              <w:t>Breve descripción de los cambios</w:t>
-            </w:r>
-          </w:p>
-        </w:tc>
-      </w:tr>
-      <w:tr>
-        <w:tc>
-          <w:tcPr>
-            <w:tcW w:w="1413" w:type="dxa"/>
-          </w:tcPr>
-          <w:p>
-            <w:pPr>
-              <w:rPr>
-                <w:rFonts w:ascii="Calibri" w:hAnsi="Calibri" w:cs="Calibri"/>
-              </w:rPr>
-            </w:pPr>
-            <w:r>
-              <w:rPr>
-                <w:rFonts w:ascii="Calibri" w:hAnsi="Calibri" w:cs="Calibri"/>
-              </w:rPr>
-              <w:t>04/02/2025</w:t>
-            </w:r>
-          </w:p>
-        </w:tc>
-        <w:tc>
-          <w:tcPr>
-            <w:tcW w:w="1984" w:type="dxa"/>
-          </w:tcPr>
-          <w:p>
-            <w:pPr>
-              <w:rPr>
-                <w:rFonts w:ascii="Calibri" w:hAnsi="Calibri" w:cs="Calibri"/>
-              </w:rPr>
-            </w:pPr>
-            <w:r>
-              <w:rPr>
-                <w:rFonts w:ascii="Calibri" w:hAnsi="Calibri" w:cs="Calibri"/>
-              </w:rPr>
-              <w:t>Student #1</w:t>
-            </w:r>
-          </w:p>
-        </w:tc>
-        <w:tc>
-          <w:tcPr>
-            <w:tcW w:w="5097" w:type="dxa"/>
-          </w:tcPr>
-          <w:p>
-            <w:pPr>
-              <w:rPr>
-                <w:rFonts w:ascii="Calibri" w:hAnsi="Calibri" w:cs="Calibri"/>
-              </w:rPr>
-            </w:pPr>
-            <w:r>
-              <w:rPr>
-                <w:rFonts w:ascii="Calibri" w:hAnsi="Calibri" w:cs="Calibri"/>
-              </w:rPr>
-              <w:t>Primera versión creada</w:t>
-            </w:r>
-          </w:p>
-        </w:tc>
-      </w:tr>
-      <w:tr>
-        <w:tc>
-          <w:tcPr>
-            <w:tcW w:w="1413" w:type="dxa"/>
-          </w:tcPr>
-          <w:p>
-            <w:pPr>
-              <w:rPr>
-                <w:rFonts w:ascii="Calibri" w:hAnsi="Calibri" w:cs="Calibri"/>
-              </w:rPr>
-            </w:pPr>
-          </w:p>
-        </w:tc>
-        <w:tc>
-          <w:tcPr>
-            <w:tcW w:w="1984" w:type="dxa"/>
-          </w:tcPr>
-          <w:p>
-            <w:pPr>
-              <w:rPr>
-                <w:rFonts w:ascii="Calibri" w:hAnsi="Calibri" w:cs="Calibri"/>
-              </w:rPr>
-            </w:pPr>
-          </w:p>
-        </w:tc>
-        <w:tc>
-          <w:tcPr>
-            <w:tcW w:w="5097" w:type="dxa"/>
-          </w:tcPr>
-          <w:p>
-            <w:pPr>
-              <w:rPr>
-                <w:rFonts w:ascii="Calibri" w:hAnsi="Calibri" w:cs="Calibri"/>
-              </w:rPr>
-            </w:pPr>
-          </w:p>
-        </w:tc>
-      </w:tr>
-    </w:tbl>
-    <w:p/>
     <w:sdt>
       <w:sdtPr>
         <w:rPr>
-          <w:rFonts w:ascii="Calibri" w:hAnsi="Calibri" w:cs="Calibri"/>
+          <w:rFonts w:ascii="Calibri" w:eastAsiaTheme="minorHAnsi" w:hAnsi="Calibri" w:cs="Calibri"/>
+          <w:color w:val="auto"/>
+          <w:kern w:val="2"/>
           <w:sz w:val="24"/>
           <w:szCs w:val="24"/>
+          <w:lang w:eastAsia="en-US"/>
+          <w14:ligatures w14:val="standardContextual"/>
         </w:rPr>
         <w:id w:val="-1518529730"/>
         <w:docPartObj>
@@ -540,13 +348,8 @@
       </w:sdtPr>
       <w:sdtEndPr>
         <w:rPr>
-          <w:rFonts w:eastAsiaTheme="minorHAnsi"/>
           <w:b/>
           <w:bCs/>
-          <w:color w:val="auto"/>
-          <w:kern w:val="2"/>
-          <w:lang w:eastAsia="en-US"/>
-          <w14:ligatures w14:val="standardContextual"/>
         </w:rPr>
       </w:sdtEndPr>
       <w:sdtContent>
@@ -587,7 +390,7 @@
               <w:tab w:val="left" w:pos="960"/>
             </w:tabs>
             <w:rPr>
-              <w:rFonts w:ascii="Calibri" w:eastAsiaTheme="minorEastAsia" w:hAnsi="Calibri" w:cs="Calibri"/>
+              <w:rFonts w:eastAsiaTheme="minorEastAsia"/>
               <w:noProof/>
               <w:lang w:eastAsia="es-ES"/>
             </w:rPr>
@@ -610,26 +413,24 @@
             </w:rPr>
             <w:fldChar w:fldCharType="separate"/>
           </w:r>
-          <w:hyperlink w:anchor="_Toc221100114" w:history="1">
+          <w:hyperlink w:anchor="_Toc221480978" w:history="1">
             <w:r>
               <w:rPr>
                 <w:rStyle w:val="Hipervnculo"/>
-                <w:rFonts w:ascii="Calibri" w:eastAsia="Calibri" w:hAnsi="Calibri" w:cs="Calibri"/>
-                <w:noProof/>
-              </w:rPr>
-              <w:t>Introducción</w:t>
-            </w:r>
-            <w:r>
-              <w:rPr>
                 <w:rFonts w:ascii="Calibri" w:hAnsi="Calibri" w:cs="Calibri"/>
                 <w:noProof/>
+              </w:rPr>
+              <w:t>Resumen ejecutivo</w:t>
+            </w:r>
+            <w:r>
+              <w:rPr>
+                <w:noProof/>
                 <w:webHidden/>
               </w:rPr>
               <w:tab/>
             </w:r>
             <w:r>
               <w:rPr>
-                <w:rFonts w:ascii="Calibri" w:hAnsi="Calibri" w:cs="Calibri"/>
                 <w:noProof/>
                 <w:webHidden/>
               </w:rPr>
@@ -637,22 +438,19 @@
             </w:r>
             <w:r>
               <w:rPr>
-                <w:rFonts w:ascii="Calibri" w:hAnsi="Calibri" w:cs="Calibri"/>
                 <w:noProof/>
                 <w:webHidden/>
               </w:rPr>
-              <w:instrText xml:space="preserve"> PAGEREF _Toc221100114 \h </w:instrText>
-            </w:r>
-            <w:r>
-              <w:rPr>
-                <w:rFonts w:ascii="Calibri" w:hAnsi="Calibri" w:cs="Calibri"/>
+              <w:instrText xml:space="preserve"> PAGEREF _Toc221480978 \h </w:instrText>
+            </w:r>
+            <w:r>
+              <w:rPr>
                 <w:noProof/>
                 <w:webHidden/>
               </w:rPr>
             </w:r>
             <w:r>
               <w:rPr>
-                <w:rFonts w:ascii="Calibri" w:hAnsi="Calibri" w:cs="Calibri"/>
                 <w:noProof/>
                 <w:webHidden/>
               </w:rPr>
@@ -660,7 +458,6 @@
             </w:r>
             <w:r>
               <w:rPr>
-                <w:rFonts w:ascii="Calibri" w:hAnsi="Calibri" w:cs="Calibri"/>
                 <w:noProof/>
                 <w:webHidden/>
               </w:rPr>
@@ -668,7 +465,6 @@
             </w:r>
             <w:r>
               <w:rPr>
-                <w:rFonts w:ascii="Calibri" w:hAnsi="Calibri" w:cs="Calibri"/>
                 <w:noProof/>
                 <w:webHidden/>
               </w:rPr>
@@ -679,27 +475,23 @@
         <w:p>
           <w:pPr>
             <w:pStyle w:val="TDC1"/>
-            <w:tabs>
-              <w:tab w:val="left" w:pos="960"/>
-            </w:tabs>
             <w:rPr>
-              <w:rFonts w:ascii="Calibri" w:eastAsiaTheme="minorEastAsia" w:hAnsi="Calibri" w:cs="Calibri"/>
+              <w:rFonts w:eastAsiaTheme="minorEastAsia"/>
               <w:noProof/>
               <w:lang w:eastAsia="es-ES"/>
             </w:rPr>
           </w:pPr>
-          <w:hyperlink w:anchor="_Toc221100115" w:history="1">
+          <w:hyperlink w:anchor="_Toc221480979" w:history="1">
             <w:r>
               <w:rPr>
                 <w:rStyle w:val="Hipervnculo"/>
-                <w:rFonts w:ascii="Calibri" w:hAnsi="Calibri" w:cs="Calibri"/>
-                <w:noProof/>
-              </w:rPr>
-              <w:t>Objetivos</w:t>
-            </w:r>
-            <w:r>
-              <w:rPr>
-                <w:rFonts w:ascii="Calibri" w:hAnsi="Calibri" w:cs="Calibri"/>
+                <w:rFonts w:ascii="Calibri" w:eastAsia="Calibri" w:hAnsi="Calibri" w:cs="Calibri"/>
+                <w:noProof/>
+              </w:rPr>
+              <w:t>Introducción</w:t>
+            </w:r>
+            <w:r>
+              <w:rPr>
                 <w:noProof/>
                 <w:webHidden/>
               </w:rPr>
@@ -707,7 +499,6 @@
             </w:r>
             <w:r>
               <w:rPr>
-                <w:rFonts w:ascii="Calibri" w:hAnsi="Calibri" w:cs="Calibri"/>
                 <w:noProof/>
                 <w:webHidden/>
               </w:rPr>
@@ -715,22 +506,19 @@
             </w:r>
             <w:r>
               <w:rPr>
-                <w:rFonts w:ascii="Calibri" w:hAnsi="Calibri" w:cs="Calibri"/>
                 <w:noProof/>
                 <w:webHidden/>
               </w:rPr>
-              <w:instrText xml:space="preserve"> PAGEREF _Toc221100115 \h </w:instrText>
-            </w:r>
-            <w:r>
-              <w:rPr>
-                <w:rFonts w:ascii="Calibri" w:hAnsi="Calibri" w:cs="Calibri"/>
+              <w:instrText xml:space="preserve"> PAGEREF _Toc221480979 \h </w:instrText>
+            </w:r>
+            <w:r>
+              <w:rPr>
                 <w:noProof/>
                 <w:webHidden/>
               </w:rPr>
             </w:r>
             <w:r>
               <w:rPr>
-                <w:rFonts w:ascii="Calibri" w:hAnsi="Calibri" w:cs="Calibri"/>
                 <w:noProof/>
                 <w:webHidden/>
               </w:rPr>
@@ -738,15 +526,13 @@
             </w:r>
             <w:r>
               <w:rPr>
-                <w:rFonts w:ascii="Calibri" w:hAnsi="Calibri" w:cs="Calibri"/>
                 <w:noProof/>
                 <w:webHidden/>
               </w:rPr>
-              <w:t>3</w:t>
-            </w:r>
-            <w:r>
-              <w:rPr>
-                <w:rFonts w:ascii="Calibri" w:hAnsi="Calibri" w:cs="Calibri"/>
+              <w:t>4</w:t>
+            </w:r>
+            <w:r>
+              <w:rPr>
                 <w:noProof/>
                 <w:webHidden/>
               </w:rPr>
@@ -757,27 +543,311 @@
         <w:p>
           <w:pPr>
             <w:pStyle w:val="TDC1"/>
-            <w:tabs>
-              <w:tab w:val="left" w:pos="960"/>
-            </w:tabs>
             <w:rPr>
-              <w:rFonts w:ascii="Calibri" w:eastAsiaTheme="minorEastAsia" w:hAnsi="Calibri" w:cs="Calibri"/>
+              <w:rFonts w:eastAsiaTheme="minorEastAsia"/>
               <w:noProof/>
               <w:lang w:eastAsia="es-ES"/>
             </w:rPr>
           </w:pPr>
-          <w:hyperlink w:anchor="_Toc221100116" w:history="1">
+          <w:hyperlink w:anchor="_Toc221480980" w:history="1">
             <w:r>
               <w:rPr>
                 <w:rStyle w:val="Hipervnculo"/>
                 <w:rFonts w:ascii="Calibri" w:hAnsi="Calibri" w:cs="Calibri"/>
                 <w:noProof/>
               </w:rPr>
+              <w:t>Contenidos</w:t>
+            </w:r>
+            <w:r>
+              <w:rPr>
+                <w:noProof/>
+                <w:webHidden/>
+              </w:rPr>
+              <w:tab/>
+            </w:r>
+            <w:r>
+              <w:rPr>
+                <w:noProof/>
+                <w:webHidden/>
+              </w:rPr>
+              <w:fldChar w:fldCharType="begin"/>
+            </w:r>
+            <w:r>
+              <w:rPr>
+                <w:noProof/>
+                <w:webHidden/>
+              </w:rPr>
+              <w:instrText xml:space="preserve"> PAGEREF _Toc221480980 \h </w:instrText>
+            </w:r>
+            <w:r>
+              <w:rPr>
+                <w:noProof/>
+                <w:webHidden/>
+              </w:rPr>
+            </w:r>
+            <w:r>
+              <w:rPr>
+                <w:noProof/>
+                <w:webHidden/>
+              </w:rPr>
+              <w:fldChar w:fldCharType="separate"/>
+            </w:r>
+            <w:r>
+              <w:rPr>
+                <w:noProof/>
+                <w:webHidden/>
+              </w:rPr>
+              <w:t>4</w:t>
+            </w:r>
+            <w:r>
+              <w:rPr>
+                <w:noProof/>
+                <w:webHidden/>
+              </w:rPr>
+              <w:fldChar w:fldCharType="end"/>
+            </w:r>
+          </w:hyperlink>
+        </w:p>
+        <w:p>
+          <w:pPr>
+            <w:pStyle w:val="TDC2"/>
+            <w:tabs>
+              <w:tab w:val="left" w:pos="960"/>
+              <w:tab w:val="right" w:leader="dot" w:pos="8494"/>
+            </w:tabs>
+            <w:rPr>
+              <w:rFonts w:eastAsiaTheme="minorEastAsia"/>
+              <w:noProof/>
+              <w:lang w:eastAsia="es-ES"/>
+            </w:rPr>
+          </w:pPr>
+          <w:r>
+            <w:rPr>
+              <w:rStyle w:val="Hipervnculo"/>
+              <w:noProof/>
+              <w:u w:val="none"/>
+            </w:rPr>
+            <w:tab/>
+          </w:r>
+          <w:hyperlink w:anchor="_Toc221480981" w:history="1">
+            <w:r>
+              <w:rPr>
+                <w:rStyle w:val="Hipervnculo"/>
+                <w:rFonts w:ascii="Calibri" w:hAnsi="Calibri" w:cs="Calibri"/>
+                <w:noProof/>
+              </w:rPr>
+              <w:t>3.1.</w:t>
+            </w:r>
+            <w:r>
+              <w:rPr>
+                <w:rStyle w:val="Hipervnculo"/>
+                <w:rFonts w:ascii="Calibri" w:hAnsi="Calibri" w:cs="Calibri"/>
+                <w:noProof/>
+              </w:rPr>
+              <w:t xml:space="preserve"> </w:t>
+            </w:r>
+            <w:r>
+              <w:rPr>
+                <w:rStyle w:val="Hipervnculo"/>
+                <w:rFonts w:ascii="Calibri" w:hAnsi="Calibri" w:cs="Calibri"/>
+                <w:noProof/>
+              </w:rPr>
+              <w:t>Proceso de reclutamiento</w:t>
+            </w:r>
+            <w:r>
+              <w:rPr>
+                <w:noProof/>
+                <w:webHidden/>
+              </w:rPr>
+              <w:tab/>
+            </w:r>
+            <w:r>
+              <w:rPr>
+                <w:noProof/>
+                <w:webHidden/>
+              </w:rPr>
+              <w:fldChar w:fldCharType="begin"/>
+            </w:r>
+            <w:r>
+              <w:rPr>
+                <w:noProof/>
+                <w:webHidden/>
+              </w:rPr>
+              <w:instrText xml:space="preserve"> PAGEREF _Toc221480981 \h </w:instrText>
+            </w:r>
+            <w:r>
+              <w:rPr>
+                <w:noProof/>
+                <w:webHidden/>
+              </w:rPr>
+            </w:r>
+            <w:r>
+              <w:rPr>
+                <w:noProof/>
+                <w:webHidden/>
+              </w:rPr>
+              <w:fldChar w:fldCharType="separate"/>
+            </w:r>
+            <w:r>
+              <w:rPr>
+                <w:noProof/>
+                <w:webHidden/>
+              </w:rPr>
+              <w:t>4</w:t>
+            </w:r>
+            <w:r>
+              <w:rPr>
+                <w:noProof/>
+                <w:webHidden/>
+              </w:rPr>
+              <w:fldChar w:fldCharType="end"/>
+            </w:r>
+          </w:hyperlink>
+        </w:p>
+        <w:p>
+          <w:pPr>
+            <w:pStyle w:val="TDC2"/>
+            <w:tabs>
+              <w:tab w:val="left" w:pos="960"/>
+              <w:tab w:val="right" w:leader="dot" w:pos="8494"/>
+            </w:tabs>
+            <w:rPr>
+              <w:rFonts w:eastAsiaTheme="minorEastAsia"/>
+              <w:noProof/>
+              <w:lang w:eastAsia="es-ES"/>
+            </w:rPr>
+          </w:pPr>
+          <w:r>
+            <w:rPr>
+              <w:rStyle w:val="Hipervnculo"/>
+              <w:noProof/>
+              <w:u w:val="none"/>
+            </w:rPr>
+            <w:tab/>
+          </w:r>
+          <w:hyperlink w:anchor="_Toc221480982" w:history="1">
+            <w:r>
+              <w:rPr>
+                <w:rStyle w:val="Hipervnculo"/>
+                <w:rFonts w:ascii="Calibri" w:hAnsi="Calibri" w:cs="Calibri"/>
+                <w:noProof/>
+              </w:rPr>
+              <w:t>3.2.</w:t>
+            </w:r>
+            <w:r>
+              <w:rPr>
+                <w:rStyle w:val="Hipervnculo"/>
+                <w:rFonts w:ascii="Calibri" w:hAnsi="Calibri" w:cs="Calibri"/>
+                <w:noProof/>
+              </w:rPr>
+              <w:t xml:space="preserve"> </w:t>
+            </w:r>
+            <w:r>
+              <w:rPr>
+                <w:rStyle w:val="Hipervnculo"/>
+                <w:rFonts w:ascii="Calibri" w:hAnsi="Calibri" w:cs="Calibri"/>
+                <w:noProof/>
+              </w:rPr>
+              <w:t>Compromiso del equipo</w:t>
+            </w:r>
+            <w:r>
+              <w:rPr>
+                <w:noProof/>
+                <w:webHidden/>
+              </w:rPr>
+              <w:tab/>
+            </w:r>
+            <w:r>
+              <w:rPr>
+                <w:noProof/>
+                <w:webHidden/>
+              </w:rPr>
+              <w:fldChar w:fldCharType="begin"/>
+            </w:r>
+            <w:r>
+              <w:rPr>
+                <w:noProof/>
+                <w:webHidden/>
+              </w:rPr>
+              <w:instrText xml:space="preserve"> PAGEREF _Toc221480982 \h </w:instrText>
+            </w:r>
+            <w:r>
+              <w:rPr>
+                <w:noProof/>
+                <w:webHidden/>
+              </w:rPr>
+            </w:r>
+            <w:r>
+              <w:rPr>
+                <w:noProof/>
+                <w:webHidden/>
+              </w:rPr>
+              <w:fldChar w:fldCharType="separate"/>
+            </w:r>
+            <w:r>
+              <w:rPr>
+                <w:noProof/>
+                <w:webHidden/>
+              </w:rPr>
+              <w:t>4</w:t>
+            </w:r>
+            <w:r>
+              <w:rPr>
+                <w:noProof/>
+                <w:webHidden/>
+              </w:rPr>
+              <w:fldChar w:fldCharType="end"/>
+            </w:r>
+          </w:hyperlink>
+        </w:p>
+        <w:p>
+          <w:pPr>
+            <w:pStyle w:val="TDC2"/>
+            <w:tabs>
+              <w:tab w:val="left" w:pos="960"/>
+              <w:tab w:val="right" w:leader="dot" w:pos="8494"/>
+            </w:tabs>
+            <w:rPr>
+              <w:rFonts w:eastAsiaTheme="minorEastAsia"/>
+              <w:noProof/>
+              <w:lang w:eastAsia="es-ES"/>
+            </w:rPr>
+          </w:pPr>
+          <w:r>
+            <w:rPr>
+              <w:rStyle w:val="Hipervnculo"/>
+              <w:noProof/>
+              <w:u w:val="none"/>
+            </w:rPr>
+            <w:tab/>
+          </w:r>
+          <w:hyperlink w:anchor="_Toc221480983" w:history="1">
+            <w:r>
+              <w:rPr>
+                <w:rStyle w:val="Hipervnculo"/>
+                <w:rFonts w:ascii="Calibri" w:hAnsi="Calibri" w:cs="Calibri"/>
+                <w:noProof/>
+              </w:rPr>
+              <w:t>3.3.</w:t>
+            </w:r>
+            <w:r>
+              <w:rPr>
+                <w:rFonts w:eastAsiaTheme="minorEastAsia"/>
+                <w:noProof/>
+                <w:lang w:eastAsia="es-ES"/>
+              </w:rPr>
+              <w:t xml:space="preserve"> </w:t>
+            </w:r>
+            <w:r>
+              <w:rPr>
+                <w:rStyle w:val="Hipervnculo"/>
+                <w:rFonts w:ascii="Calibri" w:hAnsi="Calibri" w:cs="Calibri"/>
+                <w:noProof/>
+              </w:rPr>
               <w:t>Normas del equipo</w:t>
             </w:r>
             <w:r>
               <w:rPr>
-                <w:rFonts w:ascii="Calibri" w:hAnsi="Calibri" w:cs="Calibri"/>
                 <w:noProof/>
                 <w:webHidden/>
               </w:rPr>
@@ -785,7 +855,6 @@
             </w:r>
             <w:r>
               <w:rPr>
-                <w:rFonts w:ascii="Calibri" w:hAnsi="Calibri" w:cs="Calibri"/>
                 <w:noProof/>
                 <w:webHidden/>
               </w:rPr>
@@ -793,22 +862,19 @@
             </w:r>
             <w:r>
               <w:rPr>
-                <w:rFonts w:ascii="Calibri" w:hAnsi="Calibri" w:cs="Calibri"/>
                 <w:noProof/>
                 <w:webHidden/>
               </w:rPr>
-              <w:instrText xml:space="preserve"> PAGEREF _Toc221100116 \h </w:instrText>
-            </w:r>
-            <w:r>
-              <w:rPr>
-                <w:rFonts w:ascii="Calibri" w:hAnsi="Calibri" w:cs="Calibri"/>
+              <w:instrText xml:space="preserve"> PAGEREF _Toc221480983 \h </w:instrText>
+            </w:r>
+            <w:r>
+              <w:rPr>
                 <w:noProof/>
                 <w:webHidden/>
               </w:rPr>
             </w:r>
             <w:r>
               <w:rPr>
-                <w:rFonts w:ascii="Calibri" w:hAnsi="Calibri" w:cs="Calibri"/>
                 <w:noProof/>
                 <w:webHidden/>
               </w:rPr>
@@ -816,15 +882,13 @@
             </w:r>
             <w:r>
               <w:rPr>
-                <w:rFonts w:ascii="Calibri" w:hAnsi="Calibri" w:cs="Calibri"/>
                 <w:noProof/>
                 <w:webHidden/>
               </w:rPr>
-              <w:t>4</w:t>
-            </w:r>
-            <w:r>
-              <w:rPr>
-                <w:rFonts w:ascii="Calibri" w:hAnsi="Calibri" w:cs="Calibri"/>
+              <w:t>5</w:t>
+            </w:r>
+            <w:r>
+              <w:rPr>
                 <w:noProof/>
                 <w:webHidden/>
               </w:rPr>
@@ -835,16 +899,13 @@
         <w:p>
           <w:pPr>
             <w:pStyle w:val="TDC1"/>
-            <w:tabs>
-              <w:tab w:val="left" w:pos="960"/>
-            </w:tabs>
             <w:rPr>
-              <w:rFonts w:ascii="Calibri" w:eastAsiaTheme="minorEastAsia" w:hAnsi="Calibri" w:cs="Calibri"/>
+              <w:rFonts w:eastAsiaTheme="minorEastAsia"/>
               <w:noProof/>
               <w:lang w:eastAsia="es-ES"/>
             </w:rPr>
           </w:pPr>
-          <w:hyperlink w:anchor="_Toc221100117" w:history="1">
+          <w:hyperlink w:anchor="_Toc221480984" w:history="1">
             <w:r>
               <w:rPr>
                 <w:rStyle w:val="Hipervnculo"/>
@@ -855,7 +916,6 @@
             </w:r>
             <w:r>
               <w:rPr>
-                <w:rFonts w:ascii="Calibri" w:hAnsi="Calibri" w:cs="Calibri"/>
                 <w:noProof/>
                 <w:webHidden/>
               </w:rPr>
@@ -863,7 +923,6 @@
             </w:r>
             <w:r>
               <w:rPr>
-                <w:rFonts w:ascii="Calibri" w:hAnsi="Calibri" w:cs="Calibri"/>
                 <w:noProof/>
                 <w:webHidden/>
               </w:rPr>
@@ -871,22 +930,19 @@
             </w:r>
             <w:r>
               <w:rPr>
-                <w:rFonts w:ascii="Calibri" w:hAnsi="Calibri" w:cs="Calibri"/>
                 <w:noProof/>
                 <w:webHidden/>
               </w:rPr>
-              <w:instrText xml:space="preserve"> PAGEREF _Toc221100117 \h </w:instrText>
-            </w:r>
-            <w:r>
-              <w:rPr>
-                <w:rFonts w:ascii="Calibri" w:hAnsi="Calibri" w:cs="Calibri"/>
+              <w:instrText xml:space="preserve"> PAGEREF _Toc221480984 \h </w:instrText>
+            </w:r>
+            <w:r>
+              <w:rPr>
                 <w:noProof/>
                 <w:webHidden/>
               </w:rPr>
             </w:r>
             <w:r>
               <w:rPr>
-                <w:rFonts w:ascii="Calibri" w:hAnsi="Calibri" w:cs="Calibri"/>
                 <w:noProof/>
                 <w:webHidden/>
               </w:rPr>
@@ -894,15 +950,13 @@
             </w:r>
             <w:r>
               <w:rPr>
-                <w:rFonts w:ascii="Calibri" w:hAnsi="Calibri" w:cs="Calibri"/>
                 <w:noProof/>
                 <w:webHidden/>
               </w:rPr>
-              <w:t>5</w:t>
-            </w:r>
-            <w:r>
-              <w:rPr>
-                <w:rFonts w:ascii="Calibri" w:hAnsi="Calibri" w:cs="Calibri"/>
+              <w:t>7</w:t>
+            </w:r>
+            <w:r>
+              <w:rPr>
                 <w:noProof/>
                 <w:webHidden/>
               </w:rPr>
@@ -913,16 +967,13 @@
         <w:p>
           <w:pPr>
             <w:pStyle w:val="TDC1"/>
-            <w:tabs>
-              <w:tab w:val="left" w:pos="960"/>
-            </w:tabs>
             <w:rPr>
-              <w:rFonts w:ascii="Calibri" w:eastAsiaTheme="minorEastAsia" w:hAnsi="Calibri" w:cs="Calibri"/>
+              <w:rFonts w:eastAsiaTheme="minorEastAsia"/>
               <w:noProof/>
               <w:lang w:eastAsia="es-ES"/>
             </w:rPr>
           </w:pPr>
-          <w:hyperlink w:anchor="_Toc221100118" w:history="1">
+          <w:hyperlink w:anchor="_Toc221480985" w:history="1">
             <w:r>
               <w:rPr>
                 <w:rStyle w:val="Hipervnculo"/>
@@ -933,7 +984,6 @@
             </w:r>
             <w:r>
               <w:rPr>
-                <w:rFonts w:ascii="Calibri" w:hAnsi="Calibri" w:cs="Calibri"/>
                 <w:noProof/>
                 <w:webHidden/>
               </w:rPr>
@@ -941,7 +991,6 @@
             </w:r>
             <w:r>
               <w:rPr>
-                <w:rFonts w:ascii="Calibri" w:hAnsi="Calibri" w:cs="Calibri"/>
                 <w:noProof/>
                 <w:webHidden/>
               </w:rPr>
@@ -949,22 +998,19 @@
             </w:r>
             <w:r>
               <w:rPr>
-                <w:rFonts w:ascii="Calibri" w:hAnsi="Calibri" w:cs="Calibri"/>
                 <w:noProof/>
                 <w:webHidden/>
               </w:rPr>
-              <w:instrText xml:space="preserve"> PAGEREF _Toc221100118 \h </w:instrText>
-            </w:r>
-            <w:r>
-              <w:rPr>
-                <w:rFonts w:ascii="Calibri" w:hAnsi="Calibri" w:cs="Calibri"/>
+              <w:instrText xml:space="preserve"> PAGEREF _Toc221480985 \h </w:instrText>
+            </w:r>
+            <w:r>
+              <w:rPr>
                 <w:noProof/>
                 <w:webHidden/>
               </w:rPr>
             </w:r>
             <w:r>
               <w:rPr>
-                <w:rFonts w:ascii="Calibri" w:hAnsi="Calibri" w:cs="Calibri"/>
                 <w:noProof/>
                 <w:webHidden/>
               </w:rPr>
@@ -972,15 +1018,13 @@
             </w:r>
             <w:r>
               <w:rPr>
-                <w:rFonts w:ascii="Calibri" w:hAnsi="Calibri" w:cs="Calibri"/>
                 <w:noProof/>
                 <w:webHidden/>
               </w:rPr>
-              <w:t>5</w:t>
-            </w:r>
-            <w:r>
-              <w:rPr>
-                <w:rFonts w:ascii="Calibri" w:hAnsi="Calibri" w:cs="Calibri"/>
+              <w:t>7</w:t>
+            </w:r>
+            <w:r>
+              <w:rPr>
                 <w:noProof/>
                 <w:webHidden/>
               </w:rPr>
@@ -1007,6 +1051,237 @@
     </w:sdt>
     <w:p>
       <w:pPr>
+        <w:pBdr>
+          <w:bottom w:val="single" w:sz="6" w:space="1" w:color="auto"/>
+        </w:pBdr>
+        <w:rPr>
+          <w:rFonts w:ascii="Calibri" w:hAnsi="Calibri" w:cs="Calibri"/>
+          <w:sz w:val="28"/>
+          <w:szCs w:val="28"/>
+        </w:rPr>
+      </w:pPr>
+      <w:r>
+        <w:rPr>
+          <w:rFonts w:ascii="Calibri" w:hAnsi="Calibri" w:cs="Calibri"/>
+          <w:sz w:val="28"/>
+          <w:szCs w:val="28"/>
+        </w:rPr>
+        <w:t>Histórico de modificaciones del documento</w:t>
+      </w:r>
+    </w:p>
+    <w:p/>
+    <w:tbl>
+      <w:tblPr>
+        <w:tblStyle w:val="Tablaconcuadrcula"/>
+        <w:tblW w:w="0" w:type="auto"/>
+        <w:tblLook w:val="04A0" w:firstRow="1" w:lastRow="0" w:firstColumn="1" w:lastColumn="0" w:noHBand="0" w:noVBand="1"/>
+      </w:tblPr>
+      <w:tblGrid>
+        <w:gridCol w:w="1413"/>
+        <w:gridCol w:w="1984"/>
+        <w:gridCol w:w="5097"/>
+      </w:tblGrid>
+      <w:tr>
+        <w:tc>
+          <w:tcPr>
+            <w:tcW w:w="1413" w:type="dxa"/>
+            <w:shd w:val="clear" w:color="auto" w:fill="156082"/>
+          </w:tcPr>
+          <w:p>
+            <w:pPr>
+              <w:rPr>
+                <w:rFonts w:ascii="Calibri" w:hAnsi="Calibri" w:cs="Calibri"/>
+                <w:color w:val="FFFFFF" w:themeColor="background1"/>
+              </w:rPr>
+            </w:pPr>
+            <w:r>
+              <w:rPr>
+                <w:rFonts w:ascii="Calibri" w:hAnsi="Calibri" w:cs="Calibri"/>
+                <w:color w:val="FFFFFF" w:themeColor="background1"/>
+              </w:rPr>
+              <w:t>Fecha</w:t>
+            </w:r>
+          </w:p>
+        </w:tc>
+        <w:tc>
+          <w:tcPr>
+            <w:tcW w:w="1984" w:type="dxa"/>
+            <w:shd w:val="clear" w:color="auto" w:fill="156082"/>
+          </w:tcPr>
+          <w:p>
+            <w:pPr>
+              <w:rPr>
+                <w:rFonts w:ascii="Calibri" w:hAnsi="Calibri" w:cs="Calibri"/>
+                <w:color w:val="FFFFFF" w:themeColor="background1"/>
+              </w:rPr>
+            </w:pPr>
+            <w:r>
+              <w:rPr>
+                <w:rFonts w:ascii="Calibri" w:hAnsi="Calibri" w:cs="Calibri"/>
+                <w:color w:val="FFFFFF" w:themeColor="background1"/>
+              </w:rPr>
+              <w:t>Realizada por</w:t>
+            </w:r>
+          </w:p>
+        </w:tc>
+        <w:tc>
+          <w:tcPr>
+            <w:tcW w:w="5097" w:type="dxa"/>
+            <w:shd w:val="clear" w:color="auto" w:fill="156082"/>
+          </w:tcPr>
+          <w:p>
+            <w:pPr>
+              <w:rPr>
+                <w:rFonts w:ascii="Calibri" w:hAnsi="Calibri" w:cs="Calibri"/>
+                <w:b/>
+                <w:bCs/>
+                <w:color w:val="FFFFFF" w:themeColor="background1"/>
+              </w:rPr>
+            </w:pPr>
+            <w:r>
+              <w:rPr>
+                <w:rFonts w:ascii="Calibri" w:hAnsi="Calibri" w:cs="Calibri"/>
+                <w:color w:val="FFFFFF" w:themeColor="background1"/>
+              </w:rPr>
+              <w:t>Breve descripción de los cambios</w:t>
+            </w:r>
+          </w:p>
+        </w:tc>
+      </w:tr>
+      <w:tr>
+        <w:tc>
+          <w:tcPr>
+            <w:tcW w:w="1413" w:type="dxa"/>
+          </w:tcPr>
+          <w:p>
+            <w:pPr>
+              <w:rPr>
+                <w:rFonts w:ascii="Calibri" w:hAnsi="Calibri" w:cs="Calibri"/>
+              </w:rPr>
+            </w:pPr>
+            <w:r>
+              <w:rPr>
+                <w:rFonts w:ascii="Calibri" w:hAnsi="Calibri" w:cs="Calibri"/>
+              </w:rPr>
+              <w:t>04/02/2025</w:t>
+            </w:r>
+          </w:p>
+        </w:tc>
+        <w:tc>
+          <w:tcPr>
+            <w:tcW w:w="1984" w:type="dxa"/>
+          </w:tcPr>
+          <w:p>
+            <w:pPr>
+              <w:rPr>
+                <w:rFonts w:ascii="Calibri" w:hAnsi="Calibri" w:cs="Calibri"/>
+              </w:rPr>
+            </w:pPr>
+            <w:r>
+              <w:rPr>
+                <w:rFonts w:ascii="Calibri" w:hAnsi="Calibri" w:cs="Calibri"/>
+              </w:rPr>
+              <w:t>Student #1</w:t>
+            </w:r>
+          </w:p>
+        </w:tc>
+        <w:tc>
+          <w:tcPr>
+            <w:tcW w:w="5097" w:type="dxa"/>
+          </w:tcPr>
+          <w:p>
+            <w:pPr>
+              <w:rPr>
+                <w:rFonts w:ascii="Calibri" w:hAnsi="Calibri" w:cs="Calibri"/>
+              </w:rPr>
+            </w:pPr>
+            <w:r>
+              <w:rPr>
+                <w:rFonts w:ascii="Calibri" w:hAnsi="Calibri" w:cs="Calibri"/>
+              </w:rPr>
+              <w:t>Primera versión creada</w:t>
+            </w:r>
+          </w:p>
+        </w:tc>
+      </w:tr>
+      <w:tr>
+        <w:tc>
+          <w:tcPr>
+            <w:tcW w:w="1413" w:type="dxa"/>
+          </w:tcPr>
+          <w:p>
+            <w:pPr>
+              <w:rPr>
+                <w:rFonts w:ascii="Calibri" w:hAnsi="Calibri" w:cs="Calibri"/>
+              </w:rPr>
+            </w:pPr>
+            <w:r>
+              <w:rPr>
+                <w:rFonts w:ascii="Calibri" w:hAnsi="Calibri" w:cs="Calibri"/>
+              </w:rPr>
+              <w:t>08/02/2025</w:t>
+            </w:r>
+          </w:p>
+        </w:tc>
+        <w:tc>
+          <w:tcPr>
+            <w:tcW w:w="1984" w:type="dxa"/>
+          </w:tcPr>
+          <w:p>
+            <w:pPr>
+              <w:rPr>
+                <w:rFonts w:ascii="Calibri" w:hAnsi="Calibri" w:cs="Calibri"/>
+              </w:rPr>
+            </w:pPr>
+            <w:r>
+              <w:rPr>
+                <w:rFonts w:ascii="Calibri" w:hAnsi="Calibri" w:cs="Calibri"/>
+              </w:rPr>
+              <w:t>Student #1</w:t>
+            </w:r>
+          </w:p>
+        </w:tc>
+        <w:tc>
+          <w:tcPr>
+            <w:tcW w:w="5097" w:type="dxa"/>
+          </w:tcPr>
+          <w:p>
+            <w:pPr>
+              <w:rPr>
+                <w:rFonts w:ascii="Calibri" w:hAnsi="Calibri" w:cs="Calibri"/>
+                <w:u w:val="single"/>
+              </w:rPr>
+            </w:pPr>
+            <w:r>
+              <w:rPr>
+                <w:rFonts w:ascii="Calibri" w:hAnsi="Calibri" w:cs="Calibri"/>
+              </w:rPr>
+              <w:t>Añadido resumen ejecutivo</w:t>
+            </w:r>
+            <w:r>
+              <w:rPr>
+                <w:rFonts w:ascii="Calibri" w:hAnsi="Calibri" w:cs="Calibri"/>
+              </w:rPr>
+              <w:t>, añadir apartado del proceso de reclutamiento y</w:t>
+            </w:r>
+            <w:r>
+              <w:rPr>
+                <w:rFonts w:ascii="Calibri" w:hAnsi="Calibri" w:cs="Calibri"/>
+              </w:rPr>
+              <w:t xml:space="preserve"> actualizar compromisos del equipo</w:t>
+            </w:r>
+            <w:r>
+              <w:rPr>
+                <w:rFonts w:ascii="Calibri" w:hAnsi="Calibri" w:cs="Calibri"/>
+              </w:rPr>
+              <w:t>.</w:t>
+            </w:r>
+          </w:p>
+        </w:tc>
+      </w:tr>
+    </w:tbl>
+    <w:p>
+      <w:pPr>
         <w:rPr>
           <w:rFonts w:ascii="Calibri" w:hAnsi="Calibri" w:cs="Calibri"/>
           <w:sz w:val="28"/>
@@ -1027,19 +1302,157 @@
         <w:pStyle w:val="Ttulo1"/>
         <w:numPr>
           <w:ilvl w:val="0"/>
-          <w:numId w:val="4"/>
+          <w:numId w:val="10"/>
         </w:numPr>
         <w:pBdr>
           <w:bottom w:val="single" w:sz="6" w:space="1" w:color="auto"/>
         </w:pBdr>
         <w:rPr>
+          <w:rFonts w:ascii="Calibri" w:hAnsi="Calibri" w:cs="Calibri"/>
+          <w:color w:val="auto"/>
+          <w:sz w:val="28"/>
+          <w:szCs w:val="28"/>
+        </w:rPr>
+      </w:pPr>
+      <w:bookmarkStart w:id="0" w:name="_Toc221480978"/>
+      <w:r>
+        <w:rPr>
+          <w:rFonts w:ascii="Calibri" w:hAnsi="Calibri" w:cs="Calibri"/>
+          <w:color w:val="auto"/>
+          <w:sz w:val="28"/>
+          <w:szCs w:val="28"/>
+        </w:rPr>
+        <w:lastRenderedPageBreak/>
+        <w:t>Resumen ejecutivo</w:t>
+      </w:r>
+      <w:bookmarkEnd w:id="0"/>
+    </w:p>
+    <w:p/>
+    <w:p>
+      <w:pPr>
+        <w:ind w:firstLine="360"/>
+        <w:jc w:val="both"/>
+        <w:rPr>
+          <w:rFonts w:ascii="Calibri" w:hAnsi="Calibri" w:cs="Calibri"/>
+        </w:rPr>
+      </w:pPr>
+      <w:r>
+        <w:rPr>
+          <w:rFonts w:ascii="Calibri" w:hAnsi="Calibri" w:cs="Calibri"/>
+        </w:rPr>
+        <w:t xml:space="preserve">Este documento presenta el </w:t>
+      </w:r>
+      <w:r>
+        <w:rPr>
+          <w:rFonts w:ascii="Calibri" w:hAnsi="Calibri" w:cs="Calibri"/>
+          <w:i/>
+          <w:iCs/>
+        </w:rPr>
+        <w:t>chartering report</w:t>
+      </w:r>
+      <w:r>
+        <w:rPr>
+          <w:rFonts w:ascii="Calibri" w:hAnsi="Calibri" w:cs="Calibri"/>
+        </w:rPr>
+        <w:t xml:space="preserve"> del equipo encargado del desarrollo</w:t>
+      </w:r>
+      <w:r>
+        <w:rPr>
+          <w:rFonts w:ascii="Calibri" w:hAnsi="Calibri" w:cs="Calibri"/>
+        </w:rPr>
+        <w:t xml:space="preserve"> </w:t>
+      </w:r>
+      <w:r>
+        <w:rPr>
+          <w:rFonts w:ascii="Calibri" w:hAnsi="Calibri" w:cs="Calibri"/>
+        </w:rPr>
+        <w:t xml:space="preserve">de un sistema de información web para Acme Starters, </w:t>
+      </w:r>
+      <w:r>
+        <w:rPr>
+          <w:rFonts w:ascii="Calibri" w:hAnsi="Calibri" w:cs="Calibri"/>
+        </w:rPr>
+        <w:t>S</w:t>
+      </w:r>
+      <w:r>
+        <w:rPr>
+          <w:rFonts w:ascii="Calibri" w:hAnsi="Calibri" w:cs="Calibri"/>
+        </w:rPr>
+        <w:t>.</w:t>
+      </w:r>
+      <w:r>
+        <w:rPr>
+          <w:rFonts w:ascii="Calibri" w:hAnsi="Calibri" w:cs="Calibri"/>
+        </w:rPr>
+        <w:t>A.</w:t>
+      </w:r>
+      <w:r>
+        <w:rPr>
+          <w:rFonts w:ascii="Calibri" w:hAnsi="Calibri" w:cs="Calibri"/>
+        </w:rPr>
+        <w:t>, una empresa ficticia dedicada a ayudar a emprendedores a dar visibilidad a sus ideas. El objetivo principal del proyecto es diseñar y desarrollar una aplicación web que permita a la empresa gestionar de forma más eficiente sus tareas y procesos internos, cumpliendo con los requisitos establecidos en la asignatura.</w:t>
+      </w:r>
+    </w:p>
+    <w:p>
+      <w:pPr>
+        <w:jc w:val="both"/>
+        <w:rPr>
+          <w:rFonts w:ascii="Calibri" w:hAnsi="Calibri" w:cs="Calibri"/>
+        </w:rPr>
+      </w:pPr>
+      <w:r>
+        <w:rPr>
+          <w:rFonts w:ascii="Calibri" w:hAnsi="Calibri" w:cs="Calibri"/>
+        </w:rPr>
+        <w:t xml:space="preserve">En este informe se recogen los acuerdos básicos del equipo, incluyendo los objetivos del proyecto, las normas de funcionamiento y convivencia, así como los mecanismos de recompensas y penalizaciones acordados. Estos elementos buscan fomentar una buena organización del trabajo, la colaboración entre los integrantes y un ambiente respetuoso y productivo. El </w:t>
+      </w:r>
+      <w:r>
+        <w:rPr>
+          <w:rFonts w:ascii="Calibri" w:hAnsi="Calibri" w:cs="Calibri"/>
+          <w:i/>
+          <w:iCs/>
+        </w:rPr>
+        <w:t>chartering report</w:t>
+      </w:r>
+      <w:r>
+        <w:rPr>
+          <w:rFonts w:ascii="Calibri" w:hAnsi="Calibri" w:cs="Calibri"/>
+        </w:rPr>
+        <w:t xml:space="preserve"> sirve como guía de referencia durante el desarrollo del proyecto, facilitando la coordinación del equipo y contribuyendo al cumplimiento de los entregables previstos.</w:t>
+      </w:r>
+    </w:p>
+    <w:p>
+      <w:pPr>
+        <w:rPr>
+          <w:rFonts w:ascii="Calibri" w:eastAsia="Calibri" w:hAnsi="Calibri" w:cs="Calibri"/>
+          <w:sz w:val="28"/>
+          <w:szCs w:val="28"/>
+        </w:rPr>
+      </w:pPr>
+      <w:r>
+        <w:rPr>
+          <w:rFonts w:ascii="Calibri" w:eastAsia="Calibri" w:hAnsi="Calibri" w:cs="Calibri"/>
+          <w:sz w:val="28"/>
+          <w:szCs w:val="28"/>
+        </w:rPr>
+        <w:br w:type="page"/>
+      </w:r>
+    </w:p>
+    <w:p>
+      <w:pPr>
+        <w:pStyle w:val="Ttulo1"/>
+        <w:pBdr>
+          <w:bottom w:val="single" w:sz="6" w:space="1" w:color="auto"/>
+        </w:pBdr>
+        <w:ind w:left="360"/>
+        <w:rPr>
           <w:rFonts w:ascii="Calibri" w:eastAsia="Calibri" w:hAnsi="Calibri" w:cs="Calibri"/>
           <w:color w:val="auto"/>
           <w:sz w:val="28"/>
           <w:szCs w:val="28"/>
         </w:rPr>
       </w:pPr>
-      <w:bookmarkStart w:id="0" w:name="_Toc221100114"/>
+      <w:bookmarkStart w:id="1" w:name="_Toc221480979"/>
       <w:r>
         <w:rPr>
           <w:rFonts w:ascii="Calibri" w:eastAsia="Calibri" w:hAnsi="Calibri" w:cs="Calibri"/>
@@ -1048,9 +1461,18 @@
           <w:szCs w:val="28"/>
         </w:rPr>
         <w:lastRenderedPageBreak/>
+        <w:t xml:space="preserve">2. </w:t>
+      </w:r>
+      <w:r>
+        <w:rPr>
+          <w:rFonts w:ascii="Calibri" w:eastAsia="Calibri" w:hAnsi="Calibri" w:cs="Calibri"/>
+          <w:color w:val="auto"/>
+          <w:sz w:val="28"/>
+          <w:szCs w:val="28"/>
+        </w:rPr>
         <w:t>Introducción</w:t>
       </w:r>
-      <w:bookmarkEnd w:id="0"/>
+      <w:bookmarkEnd w:id="1"/>
     </w:p>
     <w:p>
       <w:pPr>
@@ -1110,45 +1532,187 @@
         </w:rPr>
         <w:t xml:space="preserve"> normas de funcionamiento con la idea de mantener una buena organización, cumplir los entregables y aplicar buenas prácticas de trabajo en grupo.</w:t>
       </w:r>
-    </w:p>
-    <w:p>
-      <w:pPr>
-        <w:jc w:val="both"/>
-        <w:rPr>
-          <w:rFonts w:ascii="Calibri" w:hAnsi="Calibri" w:cs="Calibri"/>
-        </w:rPr>
-      </w:pPr>
-      <w:r>
-        <w:rPr>
-          <w:rFonts w:ascii="Calibri" w:hAnsi="Calibri" w:cs="Calibri"/>
-        </w:rPr>
-        <w:t xml:space="preserve">El proyecto se realiza para Acme Starters, Inc., una empresa ficticia que se dedica a ayudar a emprendedores a dar visibilidad a sus ideas. </w:t>
-      </w:r>
-      <w:r>
-        <w:rPr>
-          <w:rFonts w:ascii="Calibri" w:hAnsi="Calibri" w:cs="Calibri"/>
-        </w:rPr>
-        <w:t>Nuestro trabajo consistirá en desarrollar un sistema de información web que facilite a la empresa la gestión de sus tareas y procesos.</w:t>
-      </w:r>
-    </w:p>
-    <w:p>
-      <w:pPr>
-        <w:jc w:val="both"/>
-        <w:rPr>
-          <w:rFonts w:ascii="Calibri" w:hAnsi="Calibri" w:cs="Calibri"/>
-        </w:rPr>
-      </w:pPr>
-    </w:p>
-    <w:p>
-      <w:pPr>
-        <w:pStyle w:val="Ttulo1"/>
+      <w:r>
+        <w:rPr>
+          <w:rFonts w:ascii="Calibri" w:hAnsi="Calibri" w:cs="Calibri"/>
+        </w:rPr>
+        <w:t xml:space="preserve"> </w:t>
+      </w:r>
+      <w:r>
+        <w:rPr>
+          <w:rFonts w:ascii="Calibri" w:hAnsi="Calibri" w:cs="Calibri"/>
+        </w:rPr>
+        <w:t xml:space="preserve">El documento se estructura de la siguiente manera: </w:t>
+      </w:r>
+    </w:p>
+    <w:p>
+      <w:pPr>
+        <w:pStyle w:val="Prrafodelista"/>
         <w:numPr>
           <w:ilvl w:val="0"/>
-          <w:numId w:val="4"/>
+          <w:numId w:val="11"/>
         </w:numPr>
+        <w:jc w:val="both"/>
+        <w:rPr>
+          <w:rFonts w:ascii="Calibri" w:hAnsi="Calibri" w:cs="Calibri"/>
+        </w:rPr>
+      </w:pPr>
+      <w:r>
+        <w:rPr>
+          <w:rFonts w:ascii="Calibri" w:hAnsi="Calibri" w:cs="Calibri"/>
+        </w:rPr>
+        <w:t>Objetivos</w:t>
+      </w:r>
+      <w:r>
+        <w:rPr>
+          <w:rFonts w:ascii="Calibri" w:hAnsi="Calibri" w:cs="Calibri"/>
+        </w:rPr>
+        <w:t>:</w:t>
+      </w:r>
+      <w:r>
+        <w:rPr>
+          <w:rFonts w:ascii="Calibri" w:hAnsi="Calibri" w:cs="Calibri"/>
+        </w:rPr>
+        <w:t xml:space="preserve"> </w:t>
+      </w:r>
+      <w:r>
+        <w:rPr>
+          <w:rFonts w:ascii="Calibri" w:hAnsi="Calibri" w:cs="Calibri"/>
+        </w:rPr>
+        <w:t>S</w:t>
+      </w:r>
+      <w:r>
+        <w:rPr>
+          <w:rFonts w:ascii="Calibri" w:hAnsi="Calibri" w:cs="Calibri"/>
+        </w:rPr>
+        <w:t>e describen los objetivos académicos</w:t>
+      </w:r>
+      <w:r>
+        <w:rPr>
+          <w:rFonts w:ascii="Calibri" w:hAnsi="Calibri" w:cs="Calibri"/>
+        </w:rPr>
+        <w:t xml:space="preserve"> y organizacionales</w:t>
+      </w:r>
+      <w:r>
+        <w:rPr>
+          <w:rFonts w:ascii="Calibri" w:hAnsi="Calibri" w:cs="Calibri"/>
+        </w:rPr>
+        <w:t xml:space="preserve"> del proyect</w:t>
+      </w:r>
+      <w:r>
+        <w:rPr>
+          <w:rFonts w:ascii="Calibri" w:hAnsi="Calibri" w:cs="Calibri"/>
+        </w:rPr>
+        <w:t>o.</w:t>
+      </w:r>
+    </w:p>
+    <w:p>
+      <w:pPr>
+        <w:pStyle w:val="Prrafodelista"/>
+        <w:numPr>
+          <w:ilvl w:val="0"/>
+          <w:numId w:val="11"/>
+        </w:numPr>
+        <w:jc w:val="both"/>
+        <w:rPr>
+          <w:rFonts w:ascii="Calibri" w:hAnsi="Calibri" w:cs="Calibri"/>
+        </w:rPr>
+      </w:pPr>
+      <w:r>
+        <w:rPr>
+          <w:rFonts w:ascii="Calibri" w:hAnsi="Calibri" w:cs="Calibri"/>
+        </w:rPr>
+        <w:t>Normas del equipo</w:t>
+      </w:r>
+      <w:r>
+        <w:rPr>
+          <w:rFonts w:ascii="Calibri" w:hAnsi="Calibri" w:cs="Calibri"/>
+        </w:rPr>
+        <w:t>:</w:t>
+      </w:r>
+      <w:r>
+        <w:rPr>
+          <w:rFonts w:ascii="Calibri" w:hAnsi="Calibri" w:cs="Calibri"/>
+        </w:rPr>
+        <w:t xml:space="preserve"> </w:t>
+      </w:r>
+      <w:r>
+        <w:rPr>
+          <w:rFonts w:ascii="Calibri" w:hAnsi="Calibri" w:cs="Calibri"/>
+        </w:rPr>
+        <w:t>S</w:t>
+      </w:r>
+      <w:r>
+        <w:rPr>
+          <w:rFonts w:ascii="Calibri" w:hAnsi="Calibri" w:cs="Calibri"/>
+        </w:rPr>
+        <w:t>e recogen las normas de funcionamiento, convivencia y organización, incluyendo los sistemas de recompensas y penalizaciones</w:t>
+      </w:r>
+      <w:r>
+        <w:rPr>
+          <w:rFonts w:ascii="Calibri" w:hAnsi="Calibri" w:cs="Calibri"/>
+        </w:rPr>
+        <w:t>.</w:t>
+      </w:r>
+    </w:p>
+    <w:p>
+      <w:pPr>
+        <w:pStyle w:val="Prrafodelista"/>
+        <w:numPr>
+          <w:ilvl w:val="0"/>
+          <w:numId w:val="11"/>
+        </w:numPr>
+        <w:jc w:val="both"/>
+        <w:rPr>
+          <w:rFonts w:ascii="Calibri" w:hAnsi="Calibri" w:cs="Calibri"/>
+        </w:rPr>
+      </w:pPr>
+      <w:r>
+        <w:rPr>
+          <w:rFonts w:ascii="Calibri" w:hAnsi="Calibri" w:cs="Calibri"/>
+        </w:rPr>
+        <w:t>Conclusiones</w:t>
+      </w:r>
+      <w:r>
+        <w:rPr>
+          <w:rFonts w:ascii="Calibri" w:hAnsi="Calibri" w:cs="Calibri"/>
+        </w:rPr>
+        <w:t>:</w:t>
+      </w:r>
+      <w:r>
+        <w:rPr>
+          <w:rFonts w:ascii="Calibri" w:hAnsi="Calibri" w:cs="Calibri"/>
+        </w:rPr>
+        <w:t xml:space="preserve"> </w:t>
+      </w:r>
+      <w:r>
+        <w:rPr>
+          <w:rFonts w:ascii="Calibri" w:hAnsi="Calibri" w:cs="Calibri"/>
+        </w:rPr>
+        <w:t>S</w:t>
+      </w:r>
+      <w:r>
+        <w:rPr>
+          <w:rFonts w:ascii="Calibri" w:hAnsi="Calibri" w:cs="Calibri"/>
+        </w:rPr>
+        <w:t>e realiza una breve valoración del contenido del informe y de su utilidad como guía de trabajo para el equipo.</w:t>
+      </w:r>
+    </w:p>
+    <w:p>
+      <w:pPr>
+        <w:jc w:val="both"/>
+        <w:rPr>
+          <w:rFonts w:ascii="Calibri" w:hAnsi="Calibri" w:cs="Calibri"/>
+        </w:rPr>
+      </w:pPr>
+    </w:p>
+    <w:p>
+      <w:pPr>
+        <w:pStyle w:val="Ttulo1"/>
         <w:pBdr>
           <w:bottom w:val="single" w:sz="6" w:space="1" w:color="auto"/>
         </w:pBdr>
+        <w:ind w:left="360"/>
         <w:rPr>
           <w:rFonts w:ascii="Calibri" w:hAnsi="Calibri" w:cs="Calibri"/>
           <w:color w:val="auto"/>
@@ -1156,7 +1720,7 @@
           <w:szCs w:val="28"/>
         </w:rPr>
       </w:pPr>
-      <w:bookmarkStart w:id="1" w:name="_Toc221100115"/>
+      <w:bookmarkStart w:id="2" w:name="_Toc221480980"/>
       <w:r>
         <w:rPr>
           <w:rFonts w:ascii="Calibri" w:hAnsi="Calibri" w:cs="Calibri"/>
@@ -1164,17 +1728,84 @@
           <w:sz w:val="28"/>
           <w:szCs w:val="28"/>
         </w:rPr>
-        <w:t>Objetivos</w:t>
-      </w:r>
-      <w:bookmarkEnd w:id="1"/>
-    </w:p>
-    <w:p>
-      <w:pPr>
+        <w:t xml:space="preserve">3. </w:t>
+      </w:r>
+      <w:r>
+        <w:rPr>
+          <w:rFonts w:ascii="Calibri" w:hAnsi="Calibri" w:cs="Calibri"/>
+          <w:color w:val="auto"/>
+          <w:sz w:val="28"/>
+          <w:szCs w:val="28"/>
+        </w:rPr>
+        <w:t>Contenidos</w:t>
+      </w:r>
+      <w:bookmarkEnd w:id="2"/>
+    </w:p>
+    <w:p>
+      <w:pPr>
+        <w:pStyle w:val="Prrafodelista"/>
+        <w:numPr>
+          <w:ilvl w:val="0"/>
+          <w:numId w:val="10"/>
+        </w:numPr>
         <w:jc w:val="both"/>
         <w:rPr>
           <w:rFonts w:ascii="Calibri" w:hAnsi="Calibri" w:cs="Calibri"/>
-        </w:rPr>
-      </w:pPr>
+          <w:vanish/>
+        </w:rPr>
+      </w:pPr>
+    </w:p>
+    <w:p>
+      <w:pPr>
+        <w:pStyle w:val="Prrafodelista"/>
+        <w:numPr>
+          <w:ilvl w:val="0"/>
+          <w:numId w:val="10"/>
+        </w:numPr>
+        <w:jc w:val="both"/>
+        <w:rPr>
+          <w:rFonts w:ascii="Calibri" w:hAnsi="Calibri" w:cs="Calibri"/>
+          <w:vanish/>
+        </w:rPr>
+      </w:pPr>
+    </w:p>
+    <w:p>
+      <w:pPr>
+        <w:pStyle w:val="Prrafodelista"/>
+        <w:ind w:left="360"/>
+        <w:jc w:val="both"/>
+        <w:rPr>
+          <w:rFonts w:ascii="Calibri" w:hAnsi="Calibri" w:cs="Calibri"/>
+        </w:rPr>
+      </w:pPr>
+    </w:p>
+    <w:p>
+      <w:pPr>
+        <w:pStyle w:val="Ttulo2"/>
+        <w:numPr>
+          <w:ilvl w:val="1"/>
+          <w:numId w:val="10"/>
+        </w:numPr>
+        <w:rPr>
+          <w:rFonts w:ascii="Calibri" w:hAnsi="Calibri" w:cs="Calibri"/>
+          <w:color w:val="auto"/>
+          <w:sz w:val="24"/>
+          <w:szCs w:val="24"/>
+          <w:u w:val="single"/>
+        </w:rPr>
+      </w:pPr>
+      <w:bookmarkStart w:id="3" w:name="_Toc221480981"/>
+      <w:r>
+        <w:rPr>
+          <w:rFonts w:ascii="Calibri" w:hAnsi="Calibri" w:cs="Calibri"/>
+          <w:color w:val="auto"/>
+          <w:sz w:val="24"/>
+          <w:szCs w:val="24"/>
+          <w:u w:val="single"/>
+        </w:rPr>
+        <w:t>Proceso de reclutamiento</w:t>
+      </w:r>
+      <w:bookmarkEnd w:id="3"/>
     </w:p>
     <w:p>
       <w:pPr>
@@ -1188,13 +1819,19 @@
         <w:rPr>
           <w:rFonts w:ascii="Calibri" w:hAnsi="Calibri" w:cs="Calibri"/>
         </w:rPr>
-        <w:t>L</w:t>
-      </w:r>
-      <w:r>
-        <w:rPr>
-          <w:rFonts w:ascii="Calibri" w:hAnsi="Calibri" w:cs="Calibri"/>
-        </w:rPr>
-        <w:t>os objetivos de nuestro proyecto se centran, por un lado, en desarrollar un sistema de información web para Acme Starters, Inc., que les permita gestionar su actividad de manera más eficiente, tal y como se establece en la descripción del proyecto.</w:t>
+        <w:t>El equipo fue formado a través del foro de la asignatura, donde el manager publicó</w:t>
+      </w:r>
+      <w:r>
+        <w:rPr>
+          <w:rFonts w:ascii="Calibri" w:hAnsi="Calibri" w:cs="Calibri"/>
+        </w:rPr>
+        <w:t xml:space="preserve"> </w:t>
+      </w:r>
+      <w:r>
+        <w:rPr>
+          <w:rFonts w:ascii="Calibri" w:hAnsi="Calibri" w:cs="Calibri"/>
+        </w:rPr>
+        <w:t>una propuesta de proyecto e invitó a otros estudiantes a unirse al grupo. Tras varias respuestas y acuerdos iniciales, se constituyó el equipo de trabajo definitivo.</w:t>
       </w:r>
     </w:p>
     <w:p>
@@ -1208,26 +1845,17 @@
         <w:rPr>
           <w:rFonts w:ascii="Calibri" w:hAnsi="Calibri" w:cs="Calibri"/>
         </w:rPr>
-        <w:t>Por otro lado, como equipo nos marcamos el objetivo d</w:t>
-      </w:r>
-      <w:r>
-        <w:rPr>
-          <w:rFonts w:ascii="Calibri" w:hAnsi="Calibri" w:cs="Calibri"/>
-        </w:rPr>
-        <w:t>e conseguir una calificación de aprobado (o clase C) en la parte de evaluación correspondiente</w:t>
-      </w:r>
-      <w:r>
-        <w:rPr>
-          <w:rFonts w:ascii="Calibri" w:hAnsi="Calibri" w:cs="Calibri"/>
-        </w:rPr>
-        <w:t xml:space="preserve"> al proyecto</w:t>
-      </w:r>
-      <w:r>
-        <w:rPr>
-          <w:rFonts w:ascii="Calibri" w:hAnsi="Calibri" w:cs="Calibri"/>
-        </w:rPr>
-        <w:t>. Una vez alcanzado ese mínimo, cada miembro del equipo podrá decidir si quiere seguir trabajando para optar a una nota más alta.</w:t>
-      </w:r>
+        <w:t xml:space="preserve">Enlace al hilo de reclutamiento: </w:t>
+      </w:r>
+      <w:hyperlink r:id="rId9" w:history="1">
+        <w:r>
+          <w:rPr>
+            <w:rStyle w:val="Hipervnculo"/>
+            <w:rFonts w:ascii="Calibri" w:hAnsi="Calibri" w:cs="Calibri"/>
+          </w:rPr>
+          <w:t>https://ev.us.es/ultra/courses/_98112_1/cl/outline</w:t>
+        </w:r>
+      </w:hyperlink>
     </w:p>
     <w:p>
       <w:pPr>
@@ -1236,27 +1864,38 @@
           <w:rFonts w:ascii="Calibri" w:hAnsi="Calibri" w:cs="Calibri"/>
         </w:rPr>
       </w:pPr>
-      <w:r>
-        <w:rPr>
-          <w:rFonts w:ascii="Calibri" w:hAnsi="Calibri" w:cs="Calibri"/>
-        </w:rPr>
-        <w:t xml:space="preserve">Además, queremos mantener siempre un ambiente de respeto y una comunicación </w:t>
-      </w:r>
-      <w:r>
-        <w:rPr>
-          <w:rFonts w:ascii="Calibri" w:hAnsi="Calibri" w:cs="Calibri"/>
-        </w:rPr>
-        <w:t>constructiva</w:t>
-      </w:r>
-      <w:r>
-        <w:rPr>
-          <w:rFonts w:ascii="Calibri" w:hAnsi="Calibri" w:cs="Calibri"/>
-        </w:rPr>
-        <w:t>, porque creemos que es esencial para que el trabajo en grupo funcione bien. Hoy en día el bienestar mental es algo muy importante, y en este proyecto también queremos cuidarlo para que todos podamos trabajar a gusto y de la mejor manera posible.</w:t>
-      </w:r>
-    </w:p>
-    <w:p>
-      <w:pPr>
+    </w:p>
+    <w:p>
+      <w:pPr>
+        <w:pStyle w:val="Ttulo2"/>
+        <w:numPr>
+          <w:ilvl w:val="1"/>
+          <w:numId w:val="15"/>
+        </w:numPr>
+        <w:rPr>
+          <w:rFonts w:ascii="Calibri" w:hAnsi="Calibri" w:cs="Calibri"/>
+          <w:color w:val="auto"/>
+          <w:sz w:val="24"/>
+          <w:szCs w:val="24"/>
+          <w:u w:val="single"/>
+        </w:rPr>
+      </w:pPr>
+      <w:bookmarkStart w:id="4" w:name="_Toc221480982"/>
+      <w:r>
+        <w:rPr>
+          <w:rFonts w:ascii="Calibri" w:hAnsi="Calibri" w:cs="Calibri"/>
+          <w:color w:val="auto"/>
+          <w:sz w:val="24"/>
+          <w:szCs w:val="24"/>
+          <w:u w:val="single"/>
+        </w:rPr>
+        <w:t>Compromiso del equipo</w:t>
+      </w:r>
+      <w:bookmarkEnd w:id="4"/>
+    </w:p>
+    <w:p>
+      <w:pPr>
+        <w:ind w:firstLine="360"/>
         <w:jc w:val="both"/>
         <w:rPr>
           <w:rFonts w:ascii="Calibri" w:hAnsi="Calibri" w:cs="Calibri"/>
@@ -1266,38 +1905,444 @@
         <w:rPr>
           <w:rFonts w:ascii="Calibri" w:hAnsi="Calibri" w:cs="Calibri"/>
         </w:rPr>
+        <w:t xml:space="preserve">Como equipo nos comprometemos a desarrollar un sistema de información web para Acme Starters, </w:t>
+      </w:r>
+      <w:r>
+        <w:rPr>
+          <w:rFonts w:ascii="Calibri" w:hAnsi="Calibri" w:cs="Calibri"/>
+        </w:rPr>
+        <w:t>S.A</w:t>
+      </w:r>
+      <w:r>
+        <w:rPr>
+          <w:rFonts w:ascii="Calibri" w:hAnsi="Calibri" w:cs="Calibri"/>
+        </w:rPr>
+        <w:t>., que les permita gestionar su actividad de manera más eficiente, tal y como se establece en la descripción del proyecto.</w:t>
+      </w:r>
+    </w:p>
+    <w:p>
+      <w:pPr>
+        <w:jc w:val="both"/>
+        <w:rPr>
+          <w:rFonts w:ascii="Calibri" w:hAnsi="Calibri" w:cs="Calibri"/>
+        </w:rPr>
+      </w:pPr>
+      <w:r>
+        <w:rPr>
+          <w:rFonts w:ascii="Calibri" w:hAnsi="Calibri" w:cs="Calibri"/>
+        </w:rPr>
+        <w:t xml:space="preserve">Asimismo, </w:t>
+      </w:r>
+      <w:r>
+        <w:rPr>
+          <w:rFonts w:ascii="Calibri" w:hAnsi="Calibri" w:cs="Calibri"/>
+        </w:rPr>
+        <w:t>declara</w:t>
+      </w:r>
+      <w:r>
+        <w:rPr>
+          <w:rFonts w:ascii="Calibri" w:hAnsi="Calibri" w:cs="Calibri"/>
+        </w:rPr>
+        <w:t>mos</w:t>
+      </w:r>
+      <w:r>
+        <w:rPr>
+          <w:rFonts w:ascii="Calibri" w:hAnsi="Calibri" w:cs="Calibri"/>
+        </w:rPr>
+        <w:t xml:space="preserve"> haber leído y comprendido el programa de la asignatura, prestando especial atención a los criterios de evaluación y calificación, y </w:t>
+      </w:r>
+      <w:r>
+        <w:rPr>
+          <w:rFonts w:ascii="Calibri" w:hAnsi="Calibri" w:cs="Calibri"/>
+        </w:rPr>
+        <w:t>nos</w:t>
+      </w:r>
+      <w:r>
+        <w:rPr>
+          <w:rFonts w:ascii="Calibri" w:hAnsi="Calibri" w:cs="Calibri"/>
+        </w:rPr>
+        <w:t xml:space="preserve"> compromet</w:t>
+      </w:r>
+      <w:r>
+        <w:rPr>
+          <w:rFonts w:ascii="Calibri" w:hAnsi="Calibri" w:cs="Calibri"/>
+        </w:rPr>
+        <w:t xml:space="preserve">emos </w:t>
+      </w:r>
+      <w:r>
+        <w:rPr>
+          <w:rFonts w:ascii="Calibri" w:hAnsi="Calibri" w:cs="Calibri"/>
+        </w:rPr>
+        <w:t>a trabajar de forma conjunta para alcanzar al menos la calificación de aprobado o clase C</w:t>
+      </w:r>
+      <w:r>
+        <w:rPr>
+          <w:rFonts w:ascii="Calibri" w:hAnsi="Calibri" w:cs="Calibri"/>
+        </w:rPr>
+        <w:t xml:space="preserve">, </w:t>
+      </w:r>
+      <w:r>
+        <w:rPr>
+          <w:rFonts w:ascii="Calibri" w:hAnsi="Calibri" w:cs="Calibri"/>
+        </w:rPr>
+        <w:t>en la parte de evaluación correspondiente al proyecto. Una vez alcanzado ese mínimo, cada miembro del equipo podrá decidir si quiere seguir trabajando para optar a una nota más alta.</w:t>
+      </w:r>
+    </w:p>
+    <w:p>
+      <w:pPr>
+        <w:jc w:val="both"/>
+        <w:rPr>
+          <w:rFonts w:ascii="Calibri" w:hAnsi="Calibri" w:cs="Calibri"/>
+        </w:rPr>
+      </w:pPr>
+    </w:p>
+    <w:p>
+      <w:pPr>
+        <w:jc w:val="both"/>
+        <w:rPr>
+          <w:rFonts w:ascii="Calibri" w:hAnsi="Calibri" w:cs="Calibri"/>
+        </w:rPr>
+      </w:pPr>
+      <w:r>
+        <w:rPr>
+          <w:rFonts w:ascii="Calibri" w:hAnsi="Calibri" w:cs="Calibri"/>
+        </w:rPr>
+        <w:lastRenderedPageBreak/>
+        <w:t>Sumado a lo anterior</w:t>
+      </w:r>
+      <w:r>
+        <w:rPr>
+          <w:rFonts w:ascii="Calibri" w:hAnsi="Calibri" w:cs="Calibri"/>
+        </w:rPr>
+        <w:t xml:space="preserve">, </w:t>
+      </w:r>
+      <w:r>
+        <w:rPr>
+          <w:rFonts w:ascii="Calibri" w:hAnsi="Calibri" w:cs="Calibri"/>
+        </w:rPr>
+        <w:t>nos comprometemos a</w:t>
+      </w:r>
+      <w:r>
+        <w:rPr>
+          <w:rFonts w:ascii="Calibri" w:hAnsi="Calibri" w:cs="Calibri"/>
+        </w:rPr>
+        <w:t xml:space="preserve"> mantener siempre un ambiente de respeto y una comunicación constructiva, porque creemos que es esencial para que el trabajo en grupo funcione bien. Hoy en día el bienestar mental es algo muy importante, y en este proyecto también queremos cuidarlo para que todos podamos trabajar a gusto y de la mejor manera posible.</w:t>
+      </w:r>
+    </w:p>
+    <w:p>
+      <w:pPr>
+        <w:jc w:val="both"/>
+        <w:rPr>
+          <w:rFonts w:ascii="Calibri" w:hAnsi="Calibri" w:cs="Calibri"/>
+        </w:rPr>
+      </w:pPr>
+    </w:p>
+    <w:p>
+      <w:pPr>
+        <w:pStyle w:val="Ttulo2"/>
+        <w:numPr>
+          <w:ilvl w:val="1"/>
+          <w:numId w:val="17"/>
+        </w:numPr>
+        <w:rPr>
+          <w:rFonts w:ascii="Calibri" w:hAnsi="Calibri" w:cs="Calibri"/>
+          <w:color w:val="auto"/>
+          <w:sz w:val="24"/>
+          <w:szCs w:val="24"/>
+          <w:u w:val="single"/>
+        </w:rPr>
+      </w:pPr>
+      <w:bookmarkStart w:id="5" w:name="_Toc221480983"/>
+      <w:r>
+        <w:rPr>
+          <w:rFonts w:ascii="Calibri" w:hAnsi="Calibri" w:cs="Calibri"/>
+          <w:color w:val="auto"/>
+          <w:sz w:val="24"/>
+          <w:szCs w:val="24"/>
+          <w:u w:val="single"/>
+        </w:rPr>
+        <w:t>Normas del equipo</w:t>
+      </w:r>
+      <w:bookmarkEnd w:id="5"/>
+    </w:p>
+    <w:p>
+      <w:pPr>
+        <w:ind w:firstLine="360"/>
+        <w:jc w:val="both"/>
+        <w:rPr>
+          <w:rFonts w:ascii="Calibri" w:hAnsi="Calibri" w:cs="Calibri"/>
+        </w:rPr>
+      </w:pPr>
+      <w:r>
+        <w:rPr>
+          <w:rFonts w:ascii="Calibri" w:hAnsi="Calibri" w:cs="Calibri"/>
+        </w:rPr>
+        <w:t>En este apartado describ</w:t>
+      </w:r>
+      <w:r>
+        <w:rPr>
+          <w:rFonts w:ascii="Calibri" w:hAnsi="Calibri" w:cs="Calibri"/>
+        </w:rPr>
+        <w:t>imos</w:t>
+      </w:r>
+      <w:r>
+        <w:rPr>
+          <w:rFonts w:ascii="Calibri" w:hAnsi="Calibri" w:cs="Calibri"/>
+        </w:rPr>
+        <w:t xml:space="preserve"> las </w:t>
+      </w:r>
+      <w:r>
+        <w:rPr>
+          <w:rFonts w:ascii="Calibri" w:hAnsi="Calibri" w:cs="Calibri"/>
+        </w:rPr>
+        <w:t xml:space="preserve">normas </w:t>
+      </w:r>
+      <w:r>
+        <w:rPr>
+          <w:rFonts w:ascii="Calibri" w:hAnsi="Calibri" w:cs="Calibri"/>
+        </w:rPr>
+        <w:t xml:space="preserve">que el equipo se compromete a respetar durante el desarrollo del proyecto. </w:t>
+      </w:r>
+    </w:p>
+    <w:p>
+      <w:pPr>
+        <w:jc w:val="both"/>
+        <w:rPr>
+          <w:rFonts w:ascii="Calibri" w:hAnsi="Calibri" w:cs="Calibri"/>
+        </w:rPr>
+      </w:pPr>
+      <w:r>
+        <w:rPr>
+          <w:rFonts w:ascii="Calibri" w:hAnsi="Calibri" w:cs="Calibri"/>
+        </w:rPr>
+        <w:t>Todos los integrantes del equipo deberán asistir</w:t>
+      </w:r>
+      <w:r>
+        <w:rPr>
+          <w:rFonts w:ascii="Calibri" w:hAnsi="Calibri" w:cs="Calibri"/>
+        </w:rPr>
+        <w:t xml:space="preserve"> </w:t>
+      </w:r>
+      <w:r>
+        <w:rPr>
+          <w:rFonts w:ascii="Calibri" w:hAnsi="Calibri" w:cs="Calibri"/>
+        </w:rPr>
+        <w:t xml:space="preserve">a las sesiones de teoría y a las reuniones de seguimiento del proyecto, ya que en ellas se establecen directrices importantes para el correcto desarrollo del trabajo. Asimismo, se espera que cada miembro participe de manera activa en las </w:t>
+      </w:r>
+      <w:r>
+        <w:rPr>
+          <w:rFonts w:ascii="Calibri" w:hAnsi="Calibri" w:cs="Calibri"/>
+        </w:rPr>
+        <w:t>decisiones que deba adoptar</w:t>
+      </w:r>
+      <w:r>
+        <w:rPr>
+          <w:rFonts w:ascii="Calibri" w:hAnsi="Calibri" w:cs="Calibri"/>
+        </w:rPr>
+        <w:t xml:space="preserve"> el equipo. En caso de desacuerdo, la persona que desempeñe el rol de manager será la encargada de tomar la decisión final, con el objetivo de evitar bloqueo</w:t>
+      </w:r>
+      <w:r>
+        <w:rPr>
+          <w:rFonts w:ascii="Calibri" w:hAnsi="Calibri" w:cs="Calibri"/>
+        </w:rPr>
+        <w:t>s</w:t>
+      </w:r>
+      <w:r>
+        <w:rPr>
+          <w:rFonts w:ascii="Calibri" w:hAnsi="Calibri" w:cs="Calibri"/>
+        </w:rPr>
+        <w:t>.</w:t>
+      </w:r>
+    </w:p>
+    <w:p>
+      <w:pPr>
+        <w:jc w:val="both"/>
+        <w:rPr>
+          <w:rFonts w:ascii="Calibri" w:hAnsi="Calibri" w:cs="Calibri"/>
+        </w:rPr>
+      </w:pPr>
+      <w:r>
+        <w:rPr>
+          <w:rFonts w:ascii="Calibri" w:hAnsi="Calibri" w:cs="Calibri"/>
+        </w:rPr>
+        <w:t>Cada integrante del equipo se compromete a realizar las tareas que le sean asignadas</w:t>
+      </w:r>
+      <w:r>
+        <w:rPr>
+          <w:rFonts w:ascii="Calibri" w:hAnsi="Calibri" w:cs="Calibri"/>
+        </w:rPr>
+        <w:t xml:space="preserve"> </w:t>
+      </w:r>
+      <w:r>
+        <w:rPr>
+          <w:rFonts w:ascii="Calibri" w:hAnsi="Calibri" w:cs="Calibri"/>
+        </w:rPr>
+        <w:t>de</w:t>
+      </w:r>
+      <w:r>
+        <w:rPr>
+          <w:rFonts w:ascii="Calibri" w:hAnsi="Calibri" w:cs="Calibri"/>
+        </w:rPr>
+        <w:t>ntro de</w:t>
+      </w:r>
+      <w:r>
+        <w:rPr>
+          <w:rFonts w:ascii="Calibri" w:hAnsi="Calibri" w:cs="Calibri"/>
+        </w:rPr>
+        <w:t xml:space="preserve"> los plazos establecidos, cumpliendo los criterios de calidad exigidos por la asignatura. En caso de que surja cualquier dificultad para cumplir con una tarea, se deberá comunicar al resto del equipo con antelación para poder buscar una solución conjunta.</w:t>
+      </w:r>
+    </w:p>
+    <w:p>
+      <w:pPr>
+        <w:jc w:val="both"/>
+        <w:rPr>
+          <w:rFonts w:ascii="Calibri" w:hAnsi="Calibri" w:cs="Calibri"/>
+        </w:rPr>
+      </w:pPr>
+      <w:r>
+        <w:rPr>
+          <w:rFonts w:ascii="Calibri" w:hAnsi="Calibri" w:cs="Calibri"/>
+        </w:rPr>
+        <w:t>Además, se fomentará en todo momento un clima de respeto, comunicación y cooperación entre los miembros del equipo, así como una actitud adecuada hacia el profesorado de la asignatura. El incumplimiento reiterado de estas normas podrá dar lugar a la aplicación de medidas correctivas, como la asignación de penalizaciones</w:t>
+      </w:r>
+      <w:r>
+        <w:rPr>
+          <w:rFonts w:ascii="Calibri" w:hAnsi="Calibri" w:cs="Calibri"/>
+        </w:rPr>
+        <w:t xml:space="preserve">. </w:t>
+      </w:r>
+      <w:r>
+        <w:rPr>
+          <w:rFonts w:ascii="Calibri" w:hAnsi="Calibri" w:cs="Calibri"/>
+        </w:rPr>
+        <w:t xml:space="preserve">Por último, el rol de manager será rotativo y cambiará en cada entregable del proyecto, asignándose a un integrante del equipo que no haya desempeñado previamente dicho rol. </w:t>
+      </w:r>
+    </w:p>
+    <w:p>
+      <w:pPr>
+        <w:rPr>
+          <w:u w:val="single"/>
+        </w:rPr>
+      </w:pPr>
+      <w:r>
+        <w:rPr>
+          <w:u w:val="single"/>
+        </w:rPr>
+        <w:t>Recompensas</w:t>
+      </w:r>
+      <w:r>
+        <w:rPr>
+          <w:u w:val="single"/>
+        </w:rPr>
+        <w:t xml:space="preserve"> y penalizaciones</w:t>
+      </w:r>
+    </w:p>
+    <w:p>
+      <w:pPr>
+        <w:ind w:firstLine="708"/>
+        <w:jc w:val="both"/>
+        <w:rPr>
+          <w:rFonts w:ascii="Calibri" w:hAnsi="Calibri" w:cs="Calibri"/>
+        </w:rPr>
+      </w:pPr>
+      <w:r>
+        <w:rPr>
+          <w:rFonts w:ascii="Calibri" w:hAnsi="Calibri" w:cs="Calibri"/>
+        </w:rPr>
+        <w:t>Con el fin de fomentar la implicación y el buen funcionamiento del equipo, se tendrán en cuenta tanto las actitudes positivas como aquellas situaciones en las que no se cumplan los compromisos adquiridos.</w:t>
+      </w:r>
+    </w:p>
+    <w:p>
+      <w:pPr>
+        <w:jc w:val="both"/>
+        <w:rPr>
+          <w:rFonts w:ascii="Calibri" w:hAnsi="Calibri" w:cs="Calibri"/>
+        </w:rPr>
+      </w:pPr>
+      <w:r>
+        <w:rPr>
+          <w:rFonts w:ascii="Calibri" w:hAnsi="Calibri" w:cs="Calibri"/>
+        </w:rPr>
+        <w:t xml:space="preserve">Como recompensa, los miembros del equipo que cumplan con sus responsabilidades y demuestren un buen desempeño a lo largo del proyecto tendrán mayor libertad a la hora de elegir las tareas grupales en los distintos entregables, siempre </w:t>
+      </w:r>
+      <w:r>
+        <w:rPr>
+          <w:rFonts w:ascii="Calibri" w:hAnsi="Calibri" w:cs="Calibri"/>
+        </w:rPr>
+        <w:t xml:space="preserve">que sea </w:t>
+      </w:r>
+      <w:r>
+        <w:rPr>
+          <w:rFonts w:ascii="Calibri" w:hAnsi="Calibri" w:cs="Calibri"/>
+        </w:rPr>
+        <w:t>de forma consensuada con el resto del equipo.</w:t>
+      </w:r>
+    </w:p>
+    <w:p>
+      <w:pPr>
+        <w:jc w:val="both"/>
+        <w:rPr>
+          <w:rFonts w:ascii="Calibri" w:hAnsi="Calibri" w:cs="Calibri"/>
+        </w:rPr>
+      </w:pPr>
+      <w:r>
+        <w:rPr>
+          <w:rFonts w:ascii="Calibri" w:hAnsi="Calibri" w:cs="Calibri"/>
+        </w:rPr>
+        <w:lastRenderedPageBreak/>
+        <w:t>Por otro lado, si algún integrante muestra de forma reiterada un bajo nivel de implicación o no cumple con las tareas asignadas, esta situación será comunicada al profesorado para que esté al tanto de su desempeño. Si el problema persiste, el equipo tratará directamente la situación con el miembro afectado y, en caso de no alcanzarse un acuerdo que permita resolverlo, se podrá contemplar la expulsión de dicho integrante del equipo.</w:t>
+      </w:r>
+      <w:r>
+        <w:rPr>
+          <w:rFonts w:ascii="Calibri" w:hAnsi="Calibri" w:cs="Calibri"/>
+        </w:rPr>
         <w:br w:type="page"/>
       </w:r>
     </w:p>
     <w:p>
       <w:pPr>
         <w:pStyle w:val="Ttulo1"/>
-        <w:numPr>
-          <w:ilvl w:val="0"/>
-          <w:numId w:val="4"/>
-        </w:numPr>
         <w:pBdr>
           <w:bottom w:val="single" w:sz="6" w:space="1" w:color="auto"/>
         </w:pBdr>
+        <w:ind w:left="360"/>
         <w:rPr>
           <w:rFonts w:ascii="Calibri" w:hAnsi="Calibri" w:cs="Calibri"/>
           <w:color w:val="auto"/>
-          <w:sz w:val="24"/>
-          <w:szCs w:val="24"/>
-        </w:rPr>
-      </w:pPr>
-      <w:bookmarkStart w:id="2" w:name="_Toc221100116"/>
+          <w:sz w:val="28"/>
+          <w:szCs w:val="28"/>
+        </w:rPr>
+      </w:pPr>
+      <w:bookmarkStart w:id="6" w:name="_Toc221480984"/>
       <w:r>
         <w:rPr>
           <w:rFonts w:ascii="Calibri" w:hAnsi="Calibri" w:cs="Calibri"/>
           <w:color w:val="auto"/>
-          <w:sz w:val="24"/>
-          <w:szCs w:val="24"/>
+          <w:sz w:val="28"/>
+          <w:szCs w:val="28"/>
         </w:rPr>
         <w:lastRenderedPageBreak/>
-        <w:t>Normas del equipo</w:t>
-      </w:r>
-      <w:bookmarkEnd w:id="2"/>
+        <w:t>4.</w:t>
+      </w:r>
+      <w:r>
+        <w:rPr>
+          <w:rFonts w:ascii="Calibri" w:hAnsi="Calibri" w:cs="Calibri"/>
+          <w:color w:val="auto"/>
+          <w:sz w:val="28"/>
+          <w:szCs w:val="28"/>
+        </w:rPr>
+        <w:t xml:space="preserve"> </w:t>
+      </w:r>
+      <w:r>
+        <w:rPr>
+          <w:rFonts w:ascii="Calibri" w:hAnsi="Calibri" w:cs="Calibri"/>
+          <w:color w:val="auto"/>
+          <w:sz w:val="28"/>
+          <w:szCs w:val="28"/>
+        </w:rPr>
+        <w:t>Conclusiones</w:t>
+      </w:r>
+      <w:bookmarkEnd w:id="6"/>
     </w:p>
     <w:p>
       <w:pPr>
@@ -1309,7 +2354,6 @@
     </w:p>
     <w:p>
       <w:pPr>
-        <w:ind w:firstLine="360"/>
         <w:jc w:val="both"/>
         <w:rPr>
           <w:rFonts w:ascii="Calibri" w:hAnsi="Calibri" w:cs="Calibri"/>
@@ -1319,31 +2363,43 @@
         <w:rPr>
           <w:rFonts w:ascii="Calibri" w:hAnsi="Calibri" w:cs="Calibri"/>
         </w:rPr>
-        <w:t>En este apartado describ</w:t>
-      </w:r>
-      <w:r>
-        <w:rPr>
-          <w:rFonts w:ascii="Calibri" w:hAnsi="Calibri" w:cs="Calibri"/>
-        </w:rPr>
-        <w:t>imos</w:t>
-      </w:r>
-      <w:r>
-        <w:rPr>
-          <w:rFonts w:ascii="Calibri" w:hAnsi="Calibri" w:cs="Calibri"/>
-        </w:rPr>
-        <w:t xml:space="preserve"> las </w:t>
-      </w:r>
-      <w:r>
-        <w:rPr>
-          <w:rFonts w:ascii="Calibri" w:hAnsi="Calibri" w:cs="Calibri"/>
-        </w:rPr>
-        <w:t xml:space="preserve">normas </w:t>
-      </w:r>
-      <w:r>
-        <w:rPr>
-          <w:rFonts w:ascii="Calibri" w:hAnsi="Calibri" w:cs="Calibri"/>
-        </w:rPr>
-        <w:t xml:space="preserve">que el equipo se compromete a respetar durante el desarrollo del proyecto. </w:t>
+        <w:t>En e</w:t>
+      </w:r>
+      <w:r>
+        <w:rPr>
+          <w:rFonts w:ascii="Calibri" w:hAnsi="Calibri" w:cs="Calibri"/>
+        </w:rPr>
+        <w:t xml:space="preserve">ste </w:t>
+      </w:r>
+      <w:r>
+        <w:rPr>
+          <w:rFonts w:ascii="Calibri" w:hAnsi="Calibri" w:cs="Calibri"/>
+        </w:rPr>
+        <w:t xml:space="preserve">informe </w:t>
+      </w:r>
+      <w:r>
+        <w:rPr>
+          <w:rFonts w:ascii="Calibri" w:hAnsi="Calibri" w:cs="Calibri"/>
+        </w:rPr>
+        <w:t xml:space="preserve">hemos </w:t>
+      </w:r>
+      <w:r>
+        <w:rPr>
+          <w:rFonts w:ascii="Calibri" w:hAnsi="Calibri" w:cs="Calibri"/>
+        </w:rPr>
+        <w:t>establec</w:t>
+      </w:r>
+      <w:r>
+        <w:rPr>
+          <w:rFonts w:ascii="Calibri" w:hAnsi="Calibri" w:cs="Calibri"/>
+        </w:rPr>
+        <w:t>ido</w:t>
+      </w:r>
+      <w:r>
+        <w:rPr>
+          <w:rFonts w:ascii="Calibri" w:hAnsi="Calibri" w:cs="Calibri"/>
+        </w:rPr>
+        <w:t xml:space="preserve"> los acuerdos y compromisos que guiarán el trabajo del equipo durante el desarrollo del proyecto. A través de los objetivos y normas definidos, se busca fomentar una buena organización, la colaboración entre los integrantes y un ambiente de trabajo respetuoso.</w:t>
       </w:r>
     </w:p>
     <w:p>
@@ -1357,43 +2413,13 @@
         <w:rPr>
           <w:rFonts w:ascii="Calibri" w:hAnsi="Calibri" w:cs="Calibri"/>
         </w:rPr>
-        <w:t>Todos los integrantes del equipo deberán asistir</w:t>
-      </w:r>
-      <w:r>
-        <w:rPr>
-          <w:rFonts w:ascii="Calibri" w:hAnsi="Calibri" w:cs="Calibri"/>
-        </w:rPr>
-        <w:t xml:space="preserve"> </w:t>
-      </w:r>
-      <w:r>
-        <w:rPr>
-          <w:rFonts w:ascii="Calibri" w:hAnsi="Calibri" w:cs="Calibri"/>
-        </w:rPr>
-        <w:t xml:space="preserve">a las sesiones de teoría y a las reuniones de seguimiento del proyecto, ya que en ellas se establecen directrices importantes para el correcto desarrollo del trabajo. Asimismo, se espera que cada miembro participe de manera activa en las </w:t>
-      </w:r>
-      <w:r>
-        <w:rPr>
-          <w:rFonts w:ascii="Calibri" w:hAnsi="Calibri" w:cs="Calibri"/>
-        </w:rPr>
-        <w:t>decisiones que deba adoptar</w:t>
-      </w:r>
-      <w:r>
-        <w:rPr>
-          <w:rFonts w:ascii="Calibri" w:hAnsi="Calibri" w:cs="Calibri"/>
-        </w:rPr>
-        <w:t xml:space="preserve"> el equipo. En caso de desacuerdo, la persona que desempeñe el rol de manager será la encargada de tomar la decisión final, con el objetivo de evitar bloqueo</w:t>
-      </w:r>
-      <w:r>
-        <w:rPr>
-          <w:rFonts w:ascii="Calibri" w:hAnsi="Calibri" w:cs="Calibri"/>
-        </w:rPr>
-        <w:t>s</w:t>
-      </w:r>
-      <w:r>
-        <w:rPr>
-          <w:rFonts w:ascii="Calibri" w:hAnsi="Calibri" w:cs="Calibri"/>
-        </w:rPr>
-        <w:t>.</w:t>
+        <w:t>En conclusión</w:t>
+      </w:r>
+      <w:r>
+        <w:rPr>
+          <w:rFonts w:ascii="Calibri" w:hAnsi="Calibri" w:cs="Calibri"/>
+        </w:rPr>
+        <w:t>, el equipo afronta el proyecto con una actitud positiva y comprometida, con el objetivo de aprender, trabajar de forma coordinada y alcanzar satisfactoriamente los resultados esperados.</w:t>
       </w:r>
     </w:p>
     <w:p>
@@ -1403,153 +2429,15 @@
           <w:rFonts w:ascii="Calibri" w:hAnsi="Calibri" w:cs="Calibri"/>
         </w:rPr>
       </w:pPr>
-      <w:r>
-        <w:rPr>
-          <w:rFonts w:ascii="Calibri" w:hAnsi="Calibri" w:cs="Calibri"/>
-        </w:rPr>
-        <w:t>Cada integrante del equipo se compromete a realizar las tareas que le sean asignadas</w:t>
-      </w:r>
-      <w:r>
-        <w:rPr>
-          <w:rFonts w:ascii="Calibri" w:hAnsi="Calibri" w:cs="Calibri"/>
-        </w:rPr>
-        <w:t xml:space="preserve"> </w:t>
-      </w:r>
-      <w:r>
-        <w:rPr>
-          <w:rFonts w:ascii="Calibri" w:hAnsi="Calibri" w:cs="Calibri"/>
-        </w:rPr>
-        <w:t>de</w:t>
-      </w:r>
-      <w:r>
-        <w:rPr>
-          <w:rFonts w:ascii="Calibri" w:hAnsi="Calibri" w:cs="Calibri"/>
-        </w:rPr>
-        <w:t>ntro de</w:t>
-      </w:r>
-      <w:r>
-        <w:rPr>
-          <w:rFonts w:ascii="Calibri" w:hAnsi="Calibri" w:cs="Calibri"/>
-        </w:rPr>
-        <w:t xml:space="preserve"> los plazos establecidos, cumpliendo los criterios de calidad exigidos por la asignatura. En caso de que surja cualquier dificultad para cumplir con una tarea, se deberá comunicar al resto del equipo con antelación para poder buscar una solución conjunta.</w:t>
-      </w:r>
-    </w:p>
-    <w:p>
-      <w:pPr>
-        <w:jc w:val="both"/>
-        <w:rPr>
-          <w:rFonts w:ascii="Calibri" w:hAnsi="Calibri" w:cs="Calibri"/>
-        </w:rPr>
-      </w:pPr>
-      <w:r>
-        <w:rPr>
-          <w:rFonts w:ascii="Calibri" w:hAnsi="Calibri" w:cs="Calibri"/>
-        </w:rPr>
-        <w:t>Además, se fomentará en todo momento un clima de respeto, comunicación y cooperación entre los miembros del equipo, así como una actitud adecuada hacia el profesorado de la asignatura. El incumplimiento reiterado de estas normas podrá dar lugar a la aplicación de medidas correctivas, como la asignación de penalizaciones</w:t>
-      </w:r>
-      <w:r>
-        <w:rPr>
-          <w:rFonts w:ascii="Calibri" w:hAnsi="Calibri" w:cs="Calibri"/>
-        </w:rPr>
-        <w:t xml:space="preserve">. </w:t>
-      </w:r>
-      <w:r>
-        <w:rPr>
-          <w:rFonts w:ascii="Calibri" w:hAnsi="Calibri" w:cs="Calibri"/>
-        </w:rPr>
-        <w:t xml:space="preserve">Por último, el rol de manager será rotativo y cambiará en cada entregable del proyecto, asignándose a un integrante del equipo que no haya desempeñado previamente dicho rol. </w:t>
-      </w:r>
-    </w:p>
-    <w:p>
-      <w:pPr>
-        <w:rPr>
-          <w:u w:val="single"/>
-        </w:rPr>
-      </w:pPr>
-      <w:r>
-        <w:rPr>
-          <w:u w:val="single"/>
-        </w:rPr>
-        <w:t>Recompensas</w:t>
-      </w:r>
-      <w:r>
-        <w:rPr>
-          <w:u w:val="single"/>
-        </w:rPr>
-        <w:t xml:space="preserve"> y penalizaciones</w:t>
-      </w:r>
-    </w:p>
-    <w:p>
-      <w:pPr>
-        <w:ind w:firstLine="708"/>
-        <w:jc w:val="both"/>
-        <w:rPr>
-          <w:rFonts w:ascii="Calibri" w:hAnsi="Calibri" w:cs="Calibri"/>
-        </w:rPr>
-      </w:pPr>
-      <w:r>
-        <w:rPr>
-          <w:rFonts w:ascii="Calibri" w:hAnsi="Calibri" w:cs="Calibri"/>
-        </w:rPr>
-        <w:t>Con el fin de fomentar la implicación y el buen funcionamiento del equipo, se tendrán en cuenta tanto las actitudes positivas como aquellas situaciones en las que no se cumplan los compromisos adquiridos.</w:t>
-      </w:r>
-    </w:p>
-    <w:p>
-      <w:pPr>
-        <w:jc w:val="both"/>
-        <w:rPr>
-          <w:rFonts w:ascii="Calibri" w:hAnsi="Calibri" w:cs="Calibri"/>
-        </w:rPr>
-      </w:pPr>
-      <w:r>
-        <w:rPr>
-          <w:rFonts w:ascii="Calibri" w:hAnsi="Calibri" w:cs="Calibri"/>
-        </w:rPr>
-        <w:t xml:space="preserve">Como recompensa, los miembros del equipo que cumplan con sus responsabilidades y demuestren un buen desempeño a lo largo del proyecto tendrán mayor libertad a la hora de elegir las tareas grupales en los distintos entregables, siempre </w:t>
-      </w:r>
-      <w:r>
-        <w:rPr>
-          <w:rFonts w:ascii="Calibri" w:hAnsi="Calibri" w:cs="Calibri"/>
-        </w:rPr>
-        <w:t xml:space="preserve">que sea </w:t>
-      </w:r>
-      <w:r>
-        <w:rPr>
-          <w:rFonts w:ascii="Calibri" w:hAnsi="Calibri" w:cs="Calibri"/>
-        </w:rPr>
-        <w:t>de forma consensuada con el resto del equipo.</w:t>
-      </w:r>
-    </w:p>
-    <w:p>
-      <w:pPr>
-        <w:jc w:val="both"/>
-        <w:rPr>
-          <w:rFonts w:ascii="Calibri" w:hAnsi="Calibri" w:cs="Calibri"/>
-        </w:rPr>
-      </w:pPr>
-      <w:r>
-        <w:rPr>
-          <w:rFonts w:ascii="Calibri" w:hAnsi="Calibri" w:cs="Calibri"/>
-        </w:rPr>
-        <w:t>Por otro lado, si algún integrante muestra de forma reiterada un bajo nivel de implicación o no cumple con las tareas asignadas, esta situación será comunicada al profesorado para que esté al tanto de su desempeño. Si el problema persiste, el equipo tratará directamente la situación con el miembro afectado y, en caso de no alcanzarse un acuerdo que permita resolverlo, se podrá contemplar la expulsión de dicho integrante del equipo.</w:t>
-      </w:r>
-      <w:r>
-        <w:rPr>
-          <w:rFonts w:ascii="Calibri" w:hAnsi="Calibri" w:cs="Calibri"/>
-        </w:rPr>
-        <w:br w:type="page"/>
-      </w:r>
     </w:p>
     <w:p>
       <w:pPr>
         <w:pStyle w:val="Ttulo1"/>
-        <w:numPr>
-          <w:ilvl w:val="0"/>
-          <w:numId w:val="4"/>
-        </w:numPr>
         <w:pBdr>
           <w:bottom w:val="single" w:sz="6" w:space="1" w:color="auto"/>
         </w:pBdr>
+        <w:ind w:left="360"/>
+        <w:jc w:val="both"/>
         <w:rPr>
           <w:rFonts w:ascii="Calibri" w:hAnsi="Calibri" w:cs="Calibri"/>
           <w:color w:val="auto"/>
@@ -1557,7 +2445,7 @@
           <w:szCs w:val="28"/>
         </w:rPr>
       </w:pPr>
-      <w:bookmarkStart w:id="3" w:name="_Toc221100117"/>
+      <w:bookmarkStart w:id="7" w:name="_Toc221480985"/>
       <w:r>
         <w:rPr>
           <w:rFonts w:ascii="Calibri" w:hAnsi="Calibri" w:cs="Calibri"/>
@@ -1565,116 +2453,17 @@
           <w:sz w:val="28"/>
           <w:szCs w:val="28"/>
         </w:rPr>
-        <w:lastRenderedPageBreak/>
-        <w:t>Conclusiones</w:t>
-      </w:r>
-      <w:bookmarkEnd w:id="3"/>
-    </w:p>
-    <w:p>
-      <w:pPr>
-        <w:jc w:val="both"/>
-        <w:rPr>
-          <w:rFonts w:ascii="Calibri" w:hAnsi="Calibri" w:cs="Calibri"/>
-        </w:rPr>
-      </w:pPr>
-    </w:p>
-    <w:p>
-      <w:pPr>
-        <w:jc w:val="both"/>
-        <w:rPr>
-          <w:rFonts w:ascii="Calibri" w:hAnsi="Calibri" w:cs="Calibri"/>
-        </w:rPr>
-      </w:pPr>
-      <w:r>
-        <w:rPr>
-          <w:rFonts w:ascii="Calibri" w:hAnsi="Calibri" w:cs="Calibri"/>
-        </w:rPr>
-        <w:t>En e</w:t>
-      </w:r>
-      <w:r>
-        <w:rPr>
-          <w:rFonts w:ascii="Calibri" w:hAnsi="Calibri" w:cs="Calibri"/>
-        </w:rPr>
-        <w:t xml:space="preserve">ste </w:t>
-      </w:r>
-      <w:r>
-        <w:rPr>
-          <w:rFonts w:ascii="Calibri" w:hAnsi="Calibri" w:cs="Calibri"/>
-        </w:rPr>
-        <w:t xml:space="preserve">informe </w:t>
-      </w:r>
-      <w:r>
-        <w:rPr>
-          <w:rFonts w:ascii="Calibri" w:hAnsi="Calibri" w:cs="Calibri"/>
-        </w:rPr>
-        <w:t xml:space="preserve">hemos </w:t>
-      </w:r>
-      <w:r>
-        <w:rPr>
-          <w:rFonts w:ascii="Calibri" w:hAnsi="Calibri" w:cs="Calibri"/>
-        </w:rPr>
-        <w:t>establec</w:t>
-      </w:r>
-      <w:r>
-        <w:rPr>
-          <w:rFonts w:ascii="Calibri" w:hAnsi="Calibri" w:cs="Calibri"/>
-        </w:rPr>
-        <w:t>ido</w:t>
-      </w:r>
-      <w:r>
-        <w:rPr>
-          <w:rFonts w:ascii="Calibri" w:hAnsi="Calibri" w:cs="Calibri"/>
-        </w:rPr>
-        <w:t xml:space="preserve"> los acuerdos y compromisos que guiarán el trabajo del equipo durante el desarrollo del proyecto. A través de los objetivos y normas definidos, se busca fomentar una buena organización, la colaboración entre los integrantes y un ambiente de trabajo respetuoso.</w:t>
-      </w:r>
-    </w:p>
-    <w:p>
-      <w:pPr>
-        <w:jc w:val="both"/>
-        <w:rPr>
-          <w:rFonts w:ascii="Calibri" w:hAnsi="Calibri" w:cs="Calibri"/>
-        </w:rPr>
-      </w:pPr>
-      <w:r>
-        <w:rPr>
-          <w:rFonts w:ascii="Calibri" w:hAnsi="Calibri" w:cs="Calibri"/>
-        </w:rPr>
-        <w:t>En conclusión</w:t>
-      </w:r>
-      <w:r>
-        <w:rPr>
-          <w:rFonts w:ascii="Calibri" w:hAnsi="Calibri" w:cs="Calibri"/>
-        </w:rPr>
-        <w:t>, el equipo afronta el proyecto con una actitud positiva y comprometida, con el objetivo de aprender, trabajar de forma coordinada y alcanzar satisfactoriamente los resultados esperados.</w:t>
-      </w:r>
-    </w:p>
-    <w:p>
-      <w:pPr>
-        <w:jc w:val="both"/>
-        <w:rPr>
-          <w:rFonts w:ascii="Calibri" w:hAnsi="Calibri" w:cs="Calibri"/>
-        </w:rPr>
-      </w:pPr>
-    </w:p>
-    <w:p>
-      <w:pPr>
-        <w:pStyle w:val="Ttulo1"/>
-        <w:numPr>
-          <w:ilvl w:val="0"/>
-          <w:numId w:val="4"/>
-        </w:numPr>
-        <w:pBdr>
-          <w:bottom w:val="single" w:sz="6" w:space="1" w:color="auto"/>
-        </w:pBdr>
-        <w:jc w:val="both"/>
+        <w:t>5</w:t>
+      </w:r>
+      <w:r>
         <w:rPr>
           <w:rFonts w:ascii="Calibri" w:hAnsi="Calibri" w:cs="Calibri"/>
           <w:color w:val="auto"/>
           <w:sz w:val="28"/>
           <w:szCs w:val="28"/>
         </w:rPr>
-      </w:pPr>
-      <w:bookmarkStart w:id="4" w:name="_Toc221100118"/>
+        <w:t xml:space="preserve">. </w:t>
+      </w:r>
       <w:r>
         <w:rPr>
           <w:rFonts w:ascii="Calibri" w:hAnsi="Calibri" w:cs="Calibri"/>
@@ -1684,7 +2473,7 @@
         </w:rPr>
         <w:t>Bibliografía</w:t>
       </w:r>
-      <w:bookmarkEnd w:id="4"/>
+      <w:bookmarkEnd w:id="7"/>
     </w:p>
     <w:p>
       <w:pPr>
@@ -1725,7 +2514,7 @@
       </w:pPr>
     </w:p>
     <w:sectPr>
-      <w:footerReference w:type="default" r:id="rId9"/>
+      <w:footerReference w:type="default" r:id="rId10"/>
       <w:pgSz w:w="11906" w:h="16838"/>
       <w:pgMar w:top="1417" w:right="1701" w:bottom="1417" w:left="1701" w:header="708" w:footer="708" w:gutter="0"/>
       <w:cols w:space="708"/>
@@ -1952,6 +2741,294 @@
 <file path=word/numbering.xml><?xml version="1.0" encoding="utf-8"?>
 <w:numbering xmlns:wpc="http://schemas.microsoft.com/office/word/2010/wordprocessingCanvas" xmlns:cx="http://schemas.microsoft.com/office/drawing/2014/chartex" xmlns:cx1="http://schemas.microsoft.com/office/drawing/2015/9/8/chartex" xmlns:cx2="http://schemas.microsoft.com/office/drawing/2015/10/21/chartex" xmlns:cx3="http://schemas.microsoft.com/office/drawing/2016/5/9/chartex" xmlns:cx4="http://schemas.microsoft.com/office/drawing/2016/5/10/chartex" xmlns:cx5="http://schemas.microsoft.com/office/drawing/2016/5/11/chartex" xmlns:cx6="http://schemas.microsoft.com/office/drawing/2016/5/12/chartex" xmlns:cx7="http://schemas.microsoft.com/office/drawing/2016/5/13/chartex" xmlns:cx8="http://schemas.microsoft.com/office/drawing/2016/5/14/chartex" xmlns:mc="http://schemas.openxmlformats.org/markup-compatibility/2006" xmlns:aink="http://schemas.microsoft.com/office/drawing/2016/ink" xmlns:am3d="http://schemas.microsoft.com/office/drawing/2017/model3d" xmlns:o="urn:schemas-microsoft-com:office:office" xmlns:oel="http://schemas.microsoft.com/office/2019/extlst" xmlns:r="http://schemas.openxmlformats.org/officeDocument/2006/relationships" xmlns:m="http://schemas.openxmlformats.org/officeDocument/2006/math" xmlns:v="urn:schemas-microsoft-com:vml" xmlns:wp14="http://schemas.microsoft.com/office/word/2010/wordprocessingDrawing" xmlns:wp="http://schemas.openxmlformats.org/drawingml/2006/wordprocessingDrawing" xmlns:w10="urn:schemas-microsoft-com:office:word" xmlns:w="http://schemas.openxmlformats.org/wordprocessingml/2006/main" xmlns:w14="http://schemas.microsoft.com/office/word/2010/wordml" xmlns:w15="http://schemas.microsoft.com/office/word/2012/wordml" xmlns:w16cex="http://schemas.microsoft.com/office/word/2018/wordml/cex" xmlns:w16cid="http://schemas.microsoft.com/office/word/2016/wordml/cid" xmlns:w16="http://schemas.microsoft.com/office/word/2018/wordml" xmlns:w16du="http://schemas.microsoft.com/office/word/2023/wordml/word16du" xmlns:w16sdtdh="http://schemas.microsoft.com/office/word/2020/wordml/sdtdatahash" xmlns:w16sdtfl="http://schemas.microsoft.com/office/word/2024/wordml/sdtformatlock" xmlns:w16se="http://schemas.microsoft.com/office/word/2015/wordml/symex" xmlns:wpg="http://schemas.microsoft.com/office/word/2010/wordprocessingGroup" xmlns:wpi="http://schemas.microsoft.com/office/word/2010/wordprocessingInk" xmlns:wne="http://schemas.microsoft.com/office/word/2006/wordml" xmlns:wps="http://schemas.microsoft.com/office/word/2010/wordprocessingShape" mc:Ignorable="w14 w15 w16se w16cid w16 w16cex w16sdtdh w16sdtfl w16du wp14">
   <w:abstractNum w:abstractNumId="0" w15:restartNumberingAfterBreak="0">
+    <w:nsid w:val="005F6550"/>
+    <w:multiLevelType w:val="multilevel"/>
+    <w:tmpl w:val="0C0A001F"/>
+    <w:lvl w:ilvl="0">
+      <w:start w:val="1"/>
+      <w:numFmt w:val="decimal"/>
+      <w:lvlText w:val="%1."/>
+      <w:lvlJc w:val="left"/>
+      <w:pPr>
+        <w:ind w:left="360" w:hanging="360"/>
+      </w:pPr>
+    </w:lvl>
+    <w:lvl w:ilvl="1">
+      <w:start w:val="1"/>
+      <w:numFmt w:val="decimal"/>
+      <w:lvlText w:val="%1.%2."/>
+      <w:lvlJc w:val="left"/>
+      <w:pPr>
+        <w:ind w:left="792" w:hanging="432"/>
+      </w:pPr>
+    </w:lvl>
+    <w:lvl w:ilvl="2">
+      <w:start w:val="1"/>
+      <w:numFmt w:val="decimal"/>
+      <w:lvlText w:val="%1.%2.%3."/>
+      <w:lvlJc w:val="left"/>
+      <w:pPr>
+        <w:ind w:left="1224" w:hanging="504"/>
+      </w:pPr>
+    </w:lvl>
+    <w:lvl w:ilvl="3">
+      <w:start w:val="1"/>
+      <w:numFmt w:val="decimal"/>
+      <w:lvlText w:val="%1.%2.%3.%4."/>
+      <w:lvlJc w:val="left"/>
+      <w:pPr>
+        <w:ind w:left="1728" w:hanging="648"/>
+      </w:pPr>
+    </w:lvl>
+    <w:lvl w:ilvl="4">
+      <w:start w:val="1"/>
+      <w:numFmt w:val="decimal"/>
+      <w:lvlText w:val="%1.%2.%3.%4.%5."/>
+      <w:lvlJc w:val="left"/>
+      <w:pPr>
+        <w:ind w:left="2232" w:hanging="792"/>
+      </w:pPr>
+    </w:lvl>
+    <w:lvl w:ilvl="5">
+      <w:start w:val="1"/>
+      <w:numFmt w:val="decimal"/>
+      <w:lvlText w:val="%1.%2.%3.%4.%5.%6."/>
+      <w:lvlJc w:val="left"/>
+      <w:pPr>
+        <w:ind w:left="2736" w:hanging="936"/>
+      </w:pPr>
+    </w:lvl>
+    <w:lvl w:ilvl="6">
+      <w:start w:val="1"/>
+      <w:numFmt w:val="decimal"/>
+      <w:lvlText w:val="%1.%2.%3.%4.%5.%6.%7."/>
+      <w:lvlJc w:val="left"/>
+      <w:pPr>
+        <w:ind w:left="3240" w:hanging="1080"/>
+      </w:pPr>
+    </w:lvl>
+    <w:lvl w:ilvl="7">
+      <w:start w:val="1"/>
+      <w:numFmt w:val="decimal"/>
+      <w:lvlText w:val="%1.%2.%3.%4.%5.%6.%7.%8."/>
+      <w:lvlJc w:val="left"/>
+      <w:pPr>
+        <w:ind w:left="3744" w:hanging="1224"/>
+      </w:pPr>
+    </w:lvl>
+    <w:lvl w:ilvl="8">
+      <w:start w:val="1"/>
+      <w:numFmt w:val="decimal"/>
+      <w:lvlText w:val="%1.%2.%3.%4.%5.%6.%7.%8.%9."/>
+      <w:lvlJc w:val="left"/>
+      <w:pPr>
+        <w:ind w:left="4320" w:hanging="1440"/>
+      </w:pPr>
+    </w:lvl>
+  </w:abstractNum>
+  <w:abstractNum w:abstractNumId="1" w15:restartNumberingAfterBreak="0">
+    <w:nsid w:val="051A6AF6"/>
+    <w:multiLevelType w:val="multilevel"/>
+    <w:tmpl w:val="1B1C418E"/>
+    <w:lvl w:ilvl="0">
+      <w:start w:val="3"/>
+      <w:numFmt w:val="decimal"/>
+      <w:lvlText w:val="%1."/>
+      <w:lvlJc w:val="left"/>
+      <w:pPr>
+        <w:ind w:left="360" w:hanging="360"/>
+      </w:pPr>
+      <w:rPr>
+        <w:rFonts w:hint="default"/>
+      </w:rPr>
+    </w:lvl>
+    <w:lvl w:ilvl="1">
+      <w:start w:val="2"/>
+      <w:numFmt w:val="decimal"/>
+      <w:lvlText w:val="%1.%2."/>
+      <w:lvlJc w:val="left"/>
+      <w:pPr>
+        <w:ind w:left="792" w:hanging="432"/>
+      </w:pPr>
+      <w:rPr>
+        <w:rFonts w:hint="default"/>
+      </w:rPr>
+    </w:lvl>
+    <w:lvl w:ilvl="2">
+      <w:start w:val="1"/>
+      <w:numFmt w:val="decimal"/>
+      <w:lvlText w:val="%1.%2.%3."/>
+      <w:lvlJc w:val="left"/>
+      <w:pPr>
+        <w:ind w:left="1224" w:hanging="504"/>
+      </w:pPr>
+      <w:rPr>
+        <w:rFonts w:hint="default"/>
+      </w:rPr>
+    </w:lvl>
+    <w:lvl w:ilvl="3">
+      <w:start w:val="1"/>
+      <w:numFmt w:val="decimal"/>
+      <w:lvlText w:val="%1.%2.%3.%4."/>
+      <w:lvlJc w:val="left"/>
+      <w:pPr>
+        <w:ind w:left="1728" w:hanging="648"/>
+      </w:pPr>
+      <w:rPr>
+        <w:rFonts w:hint="default"/>
+      </w:rPr>
+    </w:lvl>
+    <w:lvl w:ilvl="4">
+      <w:start w:val="1"/>
+      <w:numFmt w:val="decimal"/>
+      <w:lvlText w:val="%1.%2.%3.%4.%5."/>
+      <w:lvlJc w:val="left"/>
+      <w:pPr>
+        <w:ind w:left="2232" w:hanging="792"/>
+      </w:pPr>
+      <w:rPr>
+        <w:rFonts w:hint="default"/>
+      </w:rPr>
+    </w:lvl>
+    <w:lvl w:ilvl="5">
+      <w:start w:val="1"/>
+      <w:numFmt w:val="decimal"/>
+      <w:lvlText w:val="%1.%2.%3.%4.%5.%6."/>
+      <w:lvlJc w:val="left"/>
+      <w:pPr>
+        <w:ind w:left="2736" w:hanging="936"/>
+      </w:pPr>
+      <w:rPr>
+        <w:rFonts w:hint="default"/>
+      </w:rPr>
+    </w:lvl>
+    <w:lvl w:ilvl="6">
+      <w:start w:val="1"/>
+      <w:numFmt w:val="decimal"/>
+      <w:lvlText w:val="%1.%2.%3.%4.%5.%6.%7."/>
+      <w:lvlJc w:val="left"/>
+      <w:pPr>
+        <w:ind w:left="3240" w:hanging="1080"/>
+      </w:pPr>
+      <w:rPr>
+        <w:rFonts w:hint="default"/>
+      </w:rPr>
+    </w:lvl>
+    <w:lvl w:ilvl="7">
+      <w:start w:val="1"/>
+      <w:numFmt w:val="decimal"/>
+      <w:lvlText w:val="%1.%2.%3.%4.%5.%6.%7.%8."/>
+      <w:lvlJc w:val="left"/>
+      <w:pPr>
+        <w:ind w:left="3744" w:hanging="1224"/>
+      </w:pPr>
+      <w:rPr>
+        <w:rFonts w:hint="default"/>
+      </w:rPr>
+    </w:lvl>
+    <w:lvl w:ilvl="8">
+      <w:start w:val="1"/>
+      <w:numFmt w:val="decimal"/>
+      <w:lvlText w:val="%1.%2.%3.%4.%5.%6.%7.%8.%9."/>
+      <w:lvlJc w:val="left"/>
+      <w:pPr>
+        <w:ind w:left="4320" w:hanging="1440"/>
+      </w:pPr>
+      <w:rPr>
+        <w:rFonts w:hint="default"/>
+      </w:rPr>
+    </w:lvl>
+  </w:abstractNum>
+  <w:abstractNum w:abstractNumId="2" w15:restartNumberingAfterBreak="0">
+    <w:nsid w:val="07087517"/>
+    <w:multiLevelType w:val="multilevel"/>
+    <w:tmpl w:val="F7340F86"/>
+    <w:lvl w:ilvl="0">
+      <w:start w:val="1"/>
+      <w:numFmt w:val="lowerLetter"/>
+      <w:lvlText w:val="%1)"/>
+      <w:lvlJc w:val="left"/>
+      <w:pPr>
+        <w:ind w:left="360" w:hanging="360"/>
+      </w:pPr>
+      <w:rPr>
+        <w:rFonts w:hint="default"/>
+      </w:rPr>
+    </w:lvl>
+    <w:lvl w:ilvl="1">
+      <w:start w:val="1"/>
+      <w:numFmt w:val="decimal"/>
+      <w:lvlText w:val="%1.%2."/>
+      <w:lvlJc w:val="left"/>
+      <w:pPr>
+        <w:ind w:left="792" w:hanging="432"/>
+      </w:pPr>
+    </w:lvl>
+    <w:lvl w:ilvl="2">
+      <w:start w:val="1"/>
+      <w:numFmt w:val="decimal"/>
+      <w:lvlText w:val="%1.%2.%3."/>
+      <w:lvlJc w:val="left"/>
+      <w:pPr>
+        <w:ind w:left="1224" w:hanging="504"/>
+      </w:pPr>
+    </w:lvl>
+    <w:lvl w:ilvl="3">
+      <w:start w:val="1"/>
+      <w:numFmt w:val="decimal"/>
+      <w:lvlText w:val="%1.%2.%3.%4."/>
+      <w:lvlJc w:val="left"/>
+      <w:pPr>
+        <w:ind w:left="1728" w:hanging="648"/>
+      </w:pPr>
+    </w:lvl>
+    <w:lvl w:ilvl="4">
+      <w:start w:val="1"/>
+      <w:numFmt w:val="decimal"/>
+      <w:lvlText w:val="%1.%2.%3.%4.%5."/>
+      <w:lvlJc w:val="left"/>
+      <w:pPr>
+        <w:ind w:left="2232" w:hanging="792"/>
+      </w:pPr>
+    </w:lvl>
+    <w:lvl w:ilvl="5">
+      <w:start w:val="1"/>
+      <w:numFmt w:val="decimal"/>
+      <w:lvlText w:val="%1.%2.%3.%4.%5.%6."/>
+      <w:lvlJc w:val="left"/>
+      <w:pPr>
+        <w:ind w:left="2736" w:hanging="936"/>
+      </w:pPr>
+    </w:lvl>
+    <w:lvl w:ilvl="6">
+      <w:start w:val="1"/>
+      <w:numFmt w:val="decimal"/>
+      <w:lvlText w:val="%1.%2.%3.%4.%5.%6.%7."/>
+      <w:lvlJc w:val="left"/>
+      <w:pPr>
+        <w:ind w:left="3240" w:hanging="1080"/>
+      </w:pPr>
+    </w:lvl>
+    <w:lvl w:ilvl="7">
+      <w:start w:val="1"/>
+      <w:numFmt w:val="decimal"/>
+      <w:lvlText w:val="%1.%2.%3.%4.%5.%6.%7.%8."/>
+      <w:lvlJc w:val="left"/>
+      <w:pPr>
+        <w:ind w:left="3744" w:hanging="1224"/>
+      </w:pPr>
+    </w:lvl>
+    <w:lvl w:ilvl="8">
+      <w:start w:val="1"/>
+      <w:numFmt w:val="decimal"/>
+      <w:lvlText w:val="%1.%2.%3.%4.%5.%6.%7.%8.%9."/>
+      <w:lvlJc w:val="left"/>
+      <w:pPr>
+        <w:ind w:left="4320" w:hanging="1440"/>
+      </w:pPr>
+    </w:lvl>
+  </w:abstractNum>
+  <w:abstractNum w:abstractNumId="3" w15:restartNumberingAfterBreak="0">
     <w:nsid w:val="09B16F91"/>
     <w:multiLevelType w:val="hybridMultilevel"/>
     <w:tmpl w:val="E5F0A92E"/>
@@ -2038,7 +3115,7 @@
       </w:pPr>
     </w:lvl>
   </w:abstractNum>
-  <w:abstractNum w:abstractNumId="1" w15:restartNumberingAfterBreak="0">
+  <w:abstractNum w:abstractNumId="4" w15:restartNumberingAfterBreak="0">
     <w:nsid w:val="0CCE63AD"/>
     <w:multiLevelType w:val="hybridMultilevel"/>
     <w:tmpl w:val="6DE8C944"/>
@@ -2127,7 +3204,120 @@
       </w:pPr>
     </w:lvl>
   </w:abstractNum>
-  <w:abstractNum w:abstractNumId="2" w15:restartNumberingAfterBreak="0">
+  <w:abstractNum w:abstractNumId="5" w15:restartNumberingAfterBreak="0">
+    <w:nsid w:val="11C90BD3"/>
+    <w:multiLevelType w:val="hybridMultilevel"/>
+    <w:tmpl w:val="A334B2F0"/>
+    <w:lvl w:ilvl="0" w:tplc="0C0A0005">
+      <w:start w:val="1"/>
+      <w:numFmt w:val="bullet"/>
+      <w:lvlText w:val=""/>
+      <w:lvlJc w:val="left"/>
+      <w:pPr>
+        <w:ind w:left="1080" w:hanging="360"/>
+      </w:pPr>
+      <w:rPr>
+        <w:rFonts w:ascii="Wingdings" w:hAnsi="Wingdings" w:hint="default"/>
+      </w:rPr>
+    </w:lvl>
+    <w:lvl w:ilvl="1" w:tplc="0C0A0003" w:tentative="1">
+      <w:start w:val="1"/>
+      <w:numFmt w:val="bullet"/>
+      <w:lvlText w:val="o"/>
+      <w:lvlJc w:val="left"/>
+      <w:pPr>
+        <w:ind w:left="1800" w:hanging="360"/>
+      </w:pPr>
+      <w:rPr>
+        <w:rFonts w:ascii="Courier New" w:hAnsi="Courier New" w:cs="Courier New" w:hint="default"/>
+      </w:rPr>
+    </w:lvl>
+    <w:lvl w:ilvl="2" w:tplc="0C0A0005" w:tentative="1">
+      <w:start w:val="1"/>
+      <w:numFmt w:val="bullet"/>
+      <w:lvlText w:val=""/>
+      <w:lvlJc w:val="left"/>
+      <w:pPr>
+        <w:ind w:left="2520" w:hanging="360"/>
+      </w:pPr>
+      <w:rPr>
+        <w:rFonts w:ascii="Wingdings" w:hAnsi="Wingdings" w:hint="default"/>
+      </w:rPr>
+    </w:lvl>
+    <w:lvl w:ilvl="3" w:tplc="0C0A0001" w:tentative="1">
+      <w:start w:val="1"/>
+      <w:numFmt w:val="bullet"/>
+      <w:lvlText w:val=""/>
+      <w:lvlJc w:val="left"/>
+      <w:pPr>
+        <w:ind w:left="3240" w:hanging="360"/>
+      </w:pPr>
+      <w:rPr>
+        <w:rFonts w:ascii="Symbol" w:hAnsi="Symbol" w:hint="default"/>
+      </w:rPr>
+    </w:lvl>
+    <w:lvl w:ilvl="4" w:tplc="0C0A0003" w:tentative="1">
+      <w:start w:val="1"/>
+      <w:numFmt w:val="bullet"/>
+      <w:lvlText w:val="o"/>
+      <w:lvlJc w:val="left"/>
+      <w:pPr>
+        <w:ind w:left="3960" w:hanging="360"/>
+      </w:pPr>
+      <w:rPr>
+        <w:rFonts w:ascii="Courier New" w:hAnsi="Courier New" w:cs="Courier New" w:hint="default"/>
+      </w:rPr>
+    </w:lvl>
+    <w:lvl w:ilvl="5" w:tplc="0C0A0005" w:tentative="1">
+      <w:start w:val="1"/>
+      <w:numFmt w:val="bullet"/>
+      <w:lvlText w:val=""/>
+      <w:lvlJc w:val="left"/>
+      <w:pPr>
+        <w:ind w:left="4680" w:hanging="360"/>
+      </w:pPr>
+      <w:rPr>
+        <w:rFonts w:ascii="Wingdings" w:hAnsi="Wingdings" w:hint="default"/>
+      </w:rPr>
+    </w:lvl>
+    <w:lvl w:ilvl="6" w:tplc="0C0A0001" w:tentative="1">
+      <w:start w:val="1"/>
+      <w:numFmt w:val="bullet"/>
+      <w:lvlText w:val=""/>
+      <w:lvlJc w:val="left"/>
+      <w:pPr>
+        <w:ind w:left="5400" w:hanging="360"/>
+      </w:pPr>
+      <w:rPr>
+        <w:rFonts w:ascii="Symbol" w:hAnsi="Symbol" w:hint="default"/>
+      </w:rPr>
+    </w:lvl>
+    <w:lvl w:ilvl="7" w:tplc="0C0A0003" w:tentative="1">
+      <w:start w:val="1"/>
+      <w:numFmt w:val="bullet"/>
+      <w:lvlText w:val="o"/>
+      <w:lvlJc w:val="left"/>
+      <w:pPr>
+        <w:ind w:left="6120" w:hanging="360"/>
+      </w:pPr>
+      <w:rPr>
+        <w:rFonts w:ascii="Courier New" w:hAnsi="Courier New" w:cs="Courier New" w:hint="default"/>
+      </w:rPr>
+    </w:lvl>
+    <w:lvl w:ilvl="8" w:tplc="0C0A0005" w:tentative="1">
+      <w:start w:val="1"/>
+      <w:numFmt w:val="bullet"/>
+      <w:lvlText w:val=""/>
+      <w:lvlJc w:val="left"/>
+      <w:pPr>
+        <w:ind w:left="6840" w:hanging="360"/>
+      </w:pPr>
+      <w:rPr>
+        <w:rFonts w:ascii="Wingdings" w:hAnsi="Wingdings" w:hint="default"/>
+      </w:rPr>
+    </w:lvl>
+  </w:abstractNum>
+  <w:abstractNum w:abstractNumId="6" w15:restartNumberingAfterBreak="0">
     <w:nsid w:val="15064016"/>
     <w:multiLevelType w:val="hybridMultilevel"/>
     <w:tmpl w:val="0E72A5EC"/>
@@ -2216,7 +3406,7 @@
       </w:pPr>
     </w:lvl>
   </w:abstractNum>
-  <w:abstractNum w:abstractNumId="3" w15:restartNumberingAfterBreak="0">
+  <w:abstractNum w:abstractNumId="7" w15:restartNumberingAfterBreak="0">
     <w:nsid w:val="30A61FFD"/>
     <w:multiLevelType w:val="hybridMultilevel"/>
     <w:tmpl w:val="146CF8C8"/>
@@ -2305,7 +3495,182 @@
       </w:pPr>
     </w:lvl>
   </w:abstractNum>
-  <w:abstractNum w:abstractNumId="4" w15:restartNumberingAfterBreak="0">
+  <w:abstractNum w:abstractNumId="8" w15:restartNumberingAfterBreak="0">
+    <w:nsid w:val="374B690F"/>
+    <w:multiLevelType w:val="hybridMultilevel"/>
+    <w:tmpl w:val="8A00C890"/>
+    <w:lvl w:ilvl="0" w:tplc="0C0A000F">
+      <w:start w:val="1"/>
+      <w:numFmt w:val="decimal"/>
+      <w:lvlText w:val="%1."/>
+      <w:lvlJc w:val="left"/>
+      <w:pPr>
+        <w:ind w:left="720" w:hanging="360"/>
+      </w:pPr>
+    </w:lvl>
+    <w:lvl w:ilvl="1" w:tplc="0C0A0019" w:tentative="1">
+      <w:start w:val="1"/>
+      <w:numFmt w:val="lowerLetter"/>
+      <w:lvlText w:val="%2."/>
+      <w:lvlJc w:val="left"/>
+      <w:pPr>
+        <w:ind w:left="1440" w:hanging="360"/>
+      </w:pPr>
+    </w:lvl>
+    <w:lvl w:ilvl="2" w:tplc="0C0A001B" w:tentative="1">
+      <w:start w:val="1"/>
+      <w:numFmt w:val="lowerRoman"/>
+      <w:lvlText w:val="%3."/>
+      <w:lvlJc w:val="right"/>
+      <w:pPr>
+        <w:ind w:left="2160" w:hanging="180"/>
+      </w:pPr>
+    </w:lvl>
+    <w:lvl w:ilvl="3" w:tplc="0C0A000F" w:tentative="1">
+      <w:start w:val="1"/>
+      <w:numFmt w:val="decimal"/>
+      <w:lvlText w:val="%4."/>
+      <w:lvlJc w:val="left"/>
+      <w:pPr>
+        <w:ind w:left="2880" w:hanging="360"/>
+      </w:pPr>
+    </w:lvl>
+    <w:lvl w:ilvl="4" w:tplc="0C0A0019" w:tentative="1">
+      <w:start w:val="1"/>
+      <w:numFmt w:val="lowerLetter"/>
+      <w:lvlText w:val="%5."/>
+      <w:lvlJc w:val="left"/>
+      <w:pPr>
+        <w:ind w:left="3600" w:hanging="360"/>
+      </w:pPr>
+    </w:lvl>
+    <w:lvl w:ilvl="5" w:tplc="0C0A001B" w:tentative="1">
+      <w:start w:val="1"/>
+      <w:numFmt w:val="lowerRoman"/>
+      <w:lvlText w:val="%6."/>
+      <w:lvlJc w:val="right"/>
+      <w:pPr>
+        <w:ind w:left="4320" w:hanging="180"/>
+      </w:pPr>
+    </w:lvl>
+    <w:lvl w:ilvl="6" w:tplc="0C0A000F" w:tentative="1">
+      <w:start w:val="1"/>
+      <w:numFmt w:val="decimal"/>
+      <w:lvlText w:val="%7."/>
+      <w:lvlJc w:val="left"/>
+      <w:pPr>
+        <w:ind w:left="5040" w:hanging="360"/>
+      </w:pPr>
+    </w:lvl>
+    <w:lvl w:ilvl="7" w:tplc="0C0A0019" w:tentative="1">
+      <w:start w:val="1"/>
+      <w:numFmt w:val="lowerLetter"/>
+      <w:lvlText w:val="%8."/>
+      <w:lvlJc w:val="left"/>
+      <w:pPr>
+        <w:ind w:left="5760" w:hanging="360"/>
+      </w:pPr>
+    </w:lvl>
+    <w:lvl w:ilvl="8" w:tplc="0C0A001B" w:tentative="1">
+      <w:start w:val="1"/>
+      <w:numFmt w:val="lowerRoman"/>
+      <w:lvlText w:val="%9."/>
+      <w:lvlJc w:val="right"/>
+      <w:pPr>
+        <w:ind w:left="6480" w:hanging="180"/>
+      </w:pPr>
+    </w:lvl>
+  </w:abstractNum>
+  <w:abstractNum w:abstractNumId="9" w15:restartNumberingAfterBreak="0">
+    <w:nsid w:val="3E9A62BE"/>
+    <w:multiLevelType w:val="multilevel"/>
+    <w:tmpl w:val="0C0A001F"/>
+    <w:lvl w:ilvl="0">
+      <w:start w:val="1"/>
+      <w:numFmt w:val="decimal"/>
+      <w:lvlText w:val="%1."/>
+      <w:lvlJc w:val="left"/>
+      <w:pPr>
+        <w:ind w:left="360" w:hanging="360"/>
+      </w:pPr>
+      <w:rPr>
+        <w:rFonts w:hint="default"/>
+      </w:rPr>
+    </w:lvl>
+    <w:lvl w:ilvl="1">
+      <w:start w:val="1"/>
+      <w:numFmt w:val="decimal"/>
+      <w:lvlText w:val="%1.%2."/>
+      <w:lvlJc w:val="left"/>
+      <w:pPr>
+        <w:ind w:left="792" w:hanging="432"/>
+      </w:pPr>
+    </w:lvl>
+    <w:lvl w:ilvl="2">
+      <w:start w:val="1"/>
+      <w:numFmt w:val="decimal"/>
+      <w:lvlText w:val="%1.%2.%3."/>
+      <w:lvlJc w:val="left"/>
+      <w:pPr>
+        <w:ind w:left="1224" w:hanging="504"/>
+      </w:pPr>
+    </w:lvl>
+    <w:lvl w:ilvl="3">
+      <w:start w:val="1"/>
+      <w:numFmt w:val="decimal"/>
+      <w:lvlText w:val="%1.%2.%3.%4."/>
+      <w:lvlJc w:val="left"/>
+      <w:pPr>
+        <w:ind w:left="1728" w:hanging="648"/>
+      </w:pPr>
+    </w:lvl>
+    <w:lvl w:ilvl="4">
+      <w:start w:val="1"/>
+      <w:numFmt w:val="decimal"/>
+      <w:lvlText w:val="%1.%2.%3.%4.%5."/>
+      <w:lvlJc w:val="left"/>
+      <w:pPr>
+        <w:ind w:left="2232" w:hanging="792"/>
+      </w:pPr>
+    </w:lvl>
+    <w:lvl w:ilvl="5">
+      <w:start w:val="1"/>
+      <w:numFmt w:val="decimal"/>
+      <w:lvlText w:val="%1.%2.%3.%4.%5.%6."/>
+      <w:lvlJc w:val="left"/>
+      <w:pPr>
+        <w:ind w:left="2736" w:hanging="936"/>
+      </w:pPr>
+    </w:lvl>
+    <w:lvl w:ilvl="6">
+      <w:start w:val="1"/>
+      <w:numFmt w:val="decimal"/>
+      <w:lvlText w:val="%1.%2.%3.%4.%5.%6.%7."/>
+      <w:lvlJc w:val="left"/>
+      <w:pPr>
+        <w:ind w:left="3240" w:hanging="1080"/>
+      </w:pPr>
+    </w:lvl>
+    <w:lvl w:ilvl="7">
+      <w:start w:val="1"/>
+      <w:numFmt w:val="decimal"/>
+      <w:lvlText w:val="%1.%2.%3.%4.%5.%6.%7.%8."/>
+      <w:lvlJc w:val="left"/>
+      <w:pPr>
+        <w:ind w:left="3744" w:hanging="1224"/>
+      </w:pPr>
+    </w:lvl>
+    <w:lvl w:ilvl="8">
+      <w:start w:val="1"/>
+      <w:numFmt w:val="decimal"/>
+      <w:lvlText w:val="%1.%2.%3.%4.%5.%6.%7.%8.%9."/>
+      <w:lvlJc w:val="left"/>
+      <w:pPr>
+        <w:ind w:left="4320" w:hanging="1440"/>
+      </w:pPr>
+    </w:lvl>
+  </w:abstractNum>
+  <w:abstractNum w:abstractNumId="10" w15:restartNumberingAfterBreak="0">
     <w:nsid w:val="407C1ED8"/>
     <w:multiLevelType w:val="hybridMultilevel"/>
     <w:tmpl w:val="D94A7B14"/>
@@ -2391,7 +3756,292 @@
       </w:pPr>
     </w:lvl>
   </w:abstractNum>
-  <w:abstractNum w:abstractNumId="5" w15:restartNumberingAfterBreak="0">
+  <w:abstractNum w:abstractNumId="11" w15:restartNumberingAfterBreak="0">
+    <w:nsid w:val="5A506610"/>
+    <w:multiLevelType w:val="multilevel"/>
+    <w:tmpl w:val="0C0A001F"/>
+    <w:lvl w:ilvl="0">
+      <w:start w:val="1"/>
+      <w:numFmt w:val="decimal"/>
+      <w:lvlText w:val="%1."/>
+      <w:lvlJc w:val="left"/>
+      <w:pPr>
+        <w:ind w:left="720" w:hanging="360"/>
+      </w:pPr>
+    </w:lvl>
+    <w:lvl w:ilvl="1">
+      <w:start w:val="1"/>
+      <w:numFmt w:val="decimal"/>
+      <w:lvlText w:val="%1.%2."/>
+      <w:lvlJc w:val="left"/>
+      <w:pPr>
+        <w:ind w:left="1152" w:hanging="432"/>
+      </w:pPr>
+    </w:lvl>
+    <w:lvl w:ilvl="2">
+      <w:start w:val="1"/>
+      <w:numFmt w:val="decimal"/>
+      <w:lvlText w:val="%1.%2.%3."/>
+      <w:lvlJc w:val="left"/>
+      <w:pPr>
+        <w:ind w:left="1584" w:hanging="504"/>
+      </w:pPr>
+    </w:lvl>
+    <w:lvl w:ilvl="3">
+      <w:start w:val="1"/>
+      <w:numFmt w:val="decimal"/>
+      <w:lvlText w:val="%1.%2.%3.%4."/>
+      <w:lvlJc w:val="left"/>
+      <w:pPr>
+        <w:ind w:left="2088" w:hanging="648"/>
+      </w:pPr>
+    </w:lvl>
+    <w:lvl w:ilvl="4">
+      <w:start w:val="1"/>
+      <w:numFmt w:val="decimal"/>
+      <w:lvlText w:val="%1.%2.%3.%4.%5."/>
+      <w:lvlJc w:val="left"/>
+      <w:pPr>
+        <w:ind w:left="2592" w:hanging="792"/>
+      </w:pPr>
+    </w:lvl>
+    <w:lvl w:ilvl="5">
+      <w:start w:val="1"/>
+      <w:numFmt w:val="decimal"/>
+      <w:lvlText w:val="%1.%2.%3.%4.%5.%6."/>
+      <w:lvlJc w:val="left"/>
+      <w:pPr>
+        <w:ind w:left="3096" w:hanging="936"/>
+      </w:pPr>
+    </w:lvl>
+    <w:lvl w:ilvl="6">
+      <w:start w:val="1"/>
+      <w:numFmt w:val="decimal"/>
+      <w:lvlText w:val="%1.%2.%3.%4.%5.%6.%7."/>
+      <w:lvlJc w:val="left"/>
+      <w:pPr>
+        <w:ind w:left="3600" w:hanging="1080"/>
+      </w:pPr>
+    </w:lvl>
+    <w:lvl w:ilvl="7">
+      <w:start w:val="1"/>
+      <w:numFmt w:val="decimal"/>
+      <w:lvlText w:val="%1.%2.%3.%4.%5.%6.%7.%8."/>
+      <w:lvlJc w:val="left"/>
+      <w:pPr>
+        <w:ind w:left="4104" w:hanging="1224"/>
+      </w:pPr>
+    </w:lvl>
+    <w:lvl w:ilvl="8">
+      <w:start w:val="1"/>
+      <w:numFmt w:val="decimal"/>
+      <w:lvlText w:val="%1.%2.%3.%4.%5.%6.%7.%8.%9."/>
+      <w:lvlJc w:val="left"/>
+      <w:pPr>
+        <w:ind w:left="4680" w:hanging="1440"/>
+      </w:pPr>
+    </w:lvl>
+  </w:abstractNum>
+  <w:abstractNum w:abstractNumId="12" w15:restartNumberingAfterBreak="0">
+    <w:nsid w:val="5BB61867"/>
+    <w:multiLevelType w:val="multilevel"/>
+    <w:tmpl w:val="283E467C"/>
+    <w:lvl w:ilvl="0">
+      <w:start w:val="3"/>
+      <w:numFmt w:val="decimal"/>
+      <w:lvlText w:val="%1."/>
+      <w:lvlJc w:val="left"/>
+      <w:pPr>
+        <w:ind w:left="360" w:hanging="360"/>
+      </w:pPr>
+      <w:rPr>
+        <w:rFonts w:hint="default"/>
+      </w:rPr>
+    </w:lvl>
+    <w:lvl w:ilvl="1">
+      <w:start w:val="3"/>
+      <w:numFmt w:val="decimal"/>
+      <w:lvlText w:val="%1.%2."/>
+      <w:lvlJc w:val="left"/>
+      <w:pPr>
+        <w:ind w:left="792" w:hanging="432"/>
+      </w:pPr>
+      <w:rPr>
+        <w:rFonts w:hint="default"/>
+      </w:rPr>
+    </w:lvl>
+    <w:lvl w:ilvl="2">
+      <w:start w:val="1"/>
+      <w:numFmt w:val="decimal"/>
+      <w:lvlText w:val="%1.%2.%3."/>
+      <w:lvlJc w:val="left"/>
+      <w:pPr>
+        <w:ind w:left="1224" w:hanging="504"/>
+      </w:pPr>
+      <w:rPr>
+        <w:rFonts w:hint="default"/>
+      </w:rPr>
+    </w:lvl>
+    <w:lvl w:ilvl="3">
+      <w:start w:val="1"/>
+      <w:numFmt w:val="decimal"/>
+      <w:lvlText w:val="%1.%2.%3.%4."/>
+      <w:lvlJc w:val="left"/>
+      <w:pPr>
+        <w:ind w:left="1728" w:hanging="648"/>
+      </w:pPr>
+      <w:rPr>
+        <w:rFonts w:hint="default"/>
+      </w:rPr>
+    </w:lvl>
+    <w:lvl w:ilvl="4">
+      <w:start w:val="1"/>
+      <w:numFmt w:val="decimal"/>
+      <w:lvlText w:val="%1.%2.%3.%4.%5."/>
+      <w:lvlJc w:val="left"/>
+      <w:pPr>
+        <w:ind w:left="2232" w:hanging="792"/>
+      </w:pPr>
+      <w:rPr>
+        <w:rFonts w:hint="default"/>
+      </w:rPr>
+    </w:lvl>
+    <w:lvl w:ilvl="5">
+      <w:start w:val="1"/>
+      <w:numFmt w:val="decimal"/>
+      <w:lvlText w:val="%1.%2.%3.%4.%5.%6."/>
+      <w:lvlJc w:val="left"/>
+      <w:pPr>
+        <w:ind w:left="2736" w:hanging="936"/>
+      </w:pPr>
+      <w:rPr>
+        <w:rFonts w:hint="default"/>
+      </w:rPr>
+    </w:lvl>
+    <w:lvl w:ilvl="6">
+      <w:start w:val="1"/>
+      <w:numFmt w:val="decimal"/>
+      <w:lvlText w:val="%1.%2.%3.%4.%5.%6.%7."/>
+      <w:lvlJc w:val="left"/>
+      <w:pPr>
+        <w:ind w:left="3240" w:hanging="1080"/>
+      </w:pPr>
+      <w:rPr>
+        <w:rFonts w:hint="default"/>
+      </w:rPr>
+    </w:lvl>
+    <w:lvl w:ilvl="7">
+      <w:start w:val="1"/>
+      <w:numFmt w:val="decimal"/>
+      <w:lvlText w:val="%1.%2.%3.%4.%5.%6.%7.%8."/>
+      <w:lvlJc w:val="left"/>
+      <w:pPr>
+        <w:ind w:left="3744" w:hanging="1224"/>
+      </w:pPr>
+      <w:rPr>
+        <w:rFonts w:hint="default"/>
+      </w:rPr>
+    </w:lvl>
+    <w:lvl w:ilvl="8">
+      <w:start w:val="1"/>
+      <w:numFmt w:val="decimal"/>
+      <w:lvlText w:val="%1.%2.%3.%4.%5.%6.%7.%8.%9."/>
+      <w:lvlJc w:val="left"/>
+      <w:pPr>
+        <w:ind w:left="4320" w:hanging="1440"/>
+      </w:pPr>
+      <w:rPr>
+        <w:rFonts w:hint="default"/>
+      </w:rPr>
+    </w:lvl>
+  </w:abstractNum>
+  <w:abstractNum w:abstractNumId="13" w15:restartNumberingAfterBreak="0">
+    <w:nsid w:val="5F921CEB"/>
+    <w:multiLevelType w:val="multilevel"/>
+    <w:tmpl w:val="0C0A001F"/>
+    <w:lvl w:ilvl="0">
+      <w:start w:val="1"/>
+      <w:numFmt w:val="decimal"/>
+      <w:lvlText w:val="%1."/>
+      <w:lvlJc w:val="left"/>
+      <w:pPr>
+        <w:ind w:left="720" w:hanging="360"/>
+      </w:pPr>
+    </w:lvl>
+    <w:lvl w:ilvl="1">
+      <w:start w:val="1"/>
+      <w:numFmt w:val="decimal"/>
+      <w:lvlText w:val="%1.%2."/>
+      <w:lvlJc w:val="left"/>
+      <w:pPr>
+        <w:ind w:left="1152" w:hanging="432"/>
+      </w:pPr>
+    </w:lvl>
+    <w:lvl w:ilvl="2">
+      <w:start w:val="1"/>
+      <w:numFmt w:val="decimal"/>
+      <w:lvlText w:val="%1.%2.%3."/>
+      <w:lvlJc w:val="left"/>
+      <w:pPr>
+        <w:ind w:left="1584" w:hanging="504"/>
+      </w:pPr>
+    </w:lvl>
+    <w:lvl w:ilvl="3">
+      <w:start w:val="1"/>
+      <w:numFmt w:val="decimal"/>
+      <w:lvlText w:val="%1.%2.%3.%4."/>
+      <w:lvlJc w:val="left"/>
+      <w:pPr>
+        <w:ind w:left="2088" w:hanging="648"/>
+      </w:pPr>
+    </w:lvl>
+    <w:lvl w:ilvl="4">
+      <w:start w:val="1"/>
+      <w:numFmt w:val="decimal"/>
+      <w:lvlText w:val="%1.%2.%3.%4.%5."/>
+      <w:lvlJc w:val="left"/>
+      <w:pPr>
+        <w:ind w:left="2592" w:hanging="792"/>
+      </w:pPr>
+    </w:lvl>
+    <w:lvl w:ilvl="5">
+      <w:start w:val="1"/>
+      <w:numFmt w:val="decimal"/>
+      <w:lvlText w:val="%1.%2.%3.%4.%5.%6."/>
+      <w:lvlJc w:val="left"/>
+      <w:pPr>
+        <w:ind w:left="3096" w:hanging="936"/>
+      </w:pPr>
+    </w:lvl>
+    <w:lvl w:ilvl="6">
+      <w:start w:val="1"/>
+      <w:numFmt w:val="decimal"/>
+      <w:lvlText w:val="%1.%2.%3.%4.%5.%6.%7."/>
+      <w:lvlJc w:val="left"/>
+      <w:pPr>
+        <w:ind w:left="3600" w:hanging="1080"/>
+      </w:pPr>
+    </w:lvl>
+    <w:lvl w:ilvl="7">
+      <w:start w:val="1"/>
+      <w:numFmt w:val="decimal"/>
+      <w:lvlText w:val="%1.%2.%3.%4.%5.%6.%7.%8."/>
+      <w:lvlJc w:val="left"/>
+      <w:pPr>
+        <w:ind w:left="4104" w:hanging="1224"/>
+      </w:pPr>
+    </w:lvl>
+    <w:lvl w:ilvl="8">
+      <w:start w:val="1"/>
+      <w:numFmt w:val="decimal"/>
+      <w:lvlText w:val="%1.%2.%3.%4.%5.%6.%7.%8.%9."/>
+      <w:lvlJc w:val="left"/>
+      <w:pPr>
+        <w:ind w:left="4680" w:hanging="1440"/>
+      </w:pPr>
+    </w:lvl>
+  </w:abstractNum>
+  <w:abstractNum w:abstractNumId="14" w15:restartNumberingAfterBreak="0">
     <w:nsid w:val="60F85B39"/>
     <w:multiLevelType w:val="hybridMultilevel"/>
     <w:tmpl w:val="CC6E11DA"/>
@@ -2480,7 +4130,7 @@
       </w:pPr>
     </w:lvl>
   </w:abstractNum>
-  <w:abstractNum w:abstractNumId="6" w15:restartNumberingAfterBreak="0">
+  <w:abstractNum w:abstractNumId="15" w15:restartNumberingAfterBreak="0">
     <w:nsid w:val="77A264E7"/>
     <w:multiLevelType w:val="hybridMultilevel"/>
     <w:tmpl w:val="ED10135C"/>
@@ -2566,7 +4216,7 @@
       </w:pPr>
     </w:lvl>
   </w:abstractNum>
-  <w:abstractNum w:abstractNumId="7" w15:restartNumberingAfterBreak="0">
+  <w:abstractNum w:abstractNumId="16" w15:restartNumberingAfterBreak="0">
     <w:nsid w:val="79807791"/>
     <w:multiLevelType w:val="hybridMultilevel"/>
     <w:tmpl w:val="165C236C"/>
@@ -2656,28 +4306,55 @@
     </w:lvl>
   </w:abstractNum>
   <w:num w:numId="1" w16cid:durableId="362751331">
+    <w:abstractNumId w:val="6"/>
+  </w:num>
+  <w:num w:numId="2" w16cid:durableId="313031711">
+    <w:abstractNumId w:val="15"/>
+  </w:num>
+  <w:num w:numId="3" w16cid:durableId="1205094211">
+    <w:abstractNumId w:val="3"/>
+  </w:num>
+  <w:num w:numId="4" w16cid:durableId="696466440">
+    <w:abstractNumId w:val="7"/>
+  </w:num>
+  <w:num w:numId="5" w16cid:durableId="2009793490">
+    <w:abstractNumId w:val="10"/>
+  </w:num>
+  <w:num w:numId="6" w16cid:durableId="1210916205">
+    <w:abstractNumId w:val="4"/>
+  </w:num>
+  <w:num w:numId="7" w16cid:durableId="1305812166">
+    <w:abstractNumId w:val="14"/>
+  </w:num>
+  <w:num w:numId="8" w16cid:durableId="516193025">
+    <w:abstractNumId w:val="16"/>
+  </w:num>
+  <w:num w:numId="9" w16cid:durableId="431633435">
+    <w:abstractNumId w:val="8"/>
+  </w:num>
+  <w:num w:numId="10" w16cid:durableId="893273063">
+    <w:abstractNumId w:val="9"/>
+  </w:num>
+  <w:num w:numId="11" w16cid:durableId="1347244150">
+    <w:abstractNumId w:val="5"/>
+  </w:num>
+  <w:num w:numId="12" w16cid:durableId="1234043599">
     <w:abstractNumId w:val="2"/>
   </w:num>
-  <w:num w:numId="2" w16cid:durableId="313031711">
-    <w:abstractNumId w:val="6"/>
+  <w:num w:numId="13" w16cid:durableId="1384910907">
+    <w:abstractNumId w:val="11"/>
   </w:num>
-  <w:num w:numId="3" w16cid:durableId="1205094211">
+  <w:num w:numId="14" w16cid:durableId="200165466">
+    <w:abstractNumId w:val="13"/>
+  </w:num>
+  <w:num w:numId="15" w16cid:durableId="225647033">
+    <w:abstractNumId w:val="1"/>
+  </w:num>
+  <w:num w:numId="16" w16cid:durableId="1092627625">
     <w:abstractNumId w:val="0"/>
   </w:num>
-  <w:num w:numId="4" w16cid:durableId="696466440">
-    <w:abstractNumId w:val="3"/>
-  </w:num>
-  <w:num w:numId="5" w16cid:durableId="2009793490">
-    <w:abstractNumId w:val="4"/>
-  </w:num>
-  <w:num w:numId="6" w16cid:durableId="1210916205">
-    <w:abstractNumId w:val="1"/>
-  </w:num>
-  <w:num w:numId="7" w16cid:durableId="1305812166">
-    <w:abstractNumId w:val="5"/>
-  </w:num>
-  <w:num w:numId="8" w16cid:durableId="516193025">
-    <w:abstractNumId w:val="7"/>
+  <w:num w:numId="17" w16cid:durableId="696007305">
+    <w:abstractNumId w:val="12"/>
   </w:num>
 </w:numbering>
 </file>
@@ -3284,6 +4961,7 @@
   <w:style w:type="character" w:default="1" w:styleId="Fuentedeprrafopredeter">
     <w:name w:val="Default Paragraph Font"/>
     <w:uiPriority w:val="1"/>
+    <w:semiHidden/>
     <w:unhideWhenUsed/>
   </w:style>
   <w:style w:type="table" w:default="1" w:styleId="Tablanormal">

</xml_diff>